<commit_message>
test: amplia testes e publica indicadores de cobertura no CI
</commit_message>
<xml_diff>
--- a/docs/roteiro-projeto.docx
+++ b/docs/roteiro-projeto.docx
@@ -482,7 +482,7 @@
         <w:rPr>
           <w:lang w:val="pt-BR"/>
         </w:rPr>
-        <w:t>Estado do projeto: planejamento. As funcionalidades, tecnologias e testes descritos a seguir são propostas para o MVP; não há implementação ou resultados de teste concluídos nesta versão do documento.</w:t>
+        <w:t>Estado do projeto em 9 de outubro de 2026: fundação implementada para contas adultas, autenticação e perfis esportivos privados em backend, web e mobile. O MVP completo permanece em desenvolvimento. As seções 3.1 e 3.2 registram código e testes comprovados; requisitos e cenários de domínio ainda não implementados permanecem planejados.</w:t>
       </w:r>
     </w:p>
     <w:p>
@@ -14049,7 +14049,7 @@
                 <w:sz w:val="16"/>
                 <w:lang w:val="pt-BR"/>
               </w:rPr>
-              <w:t>Ainda não criado ou informado.</w:t>
+              <w:t>https://github.com/davicl04/arena</w:t>
             </w:r>
           </w:p>
         </w:tc>
@@ -14114,15 +14114,14 @@
                 <w:sz w:val="16"/>
                 <w:lang w:val="pt-BR"/>
               </w:rPr>
-              <w:t>TypeScript</w:t>
-            </w:r>
-            <w:proofErr w:type="spellEnd"/>
-            <w:r>
-              <w:rPr>
-                <w:sz w:val="16"/>
-                <w:lang w:val="pt-BR"/>
-              </w:rPr>
-              <w:t xml:space="preserve"> (clientes) e Python (API), planejados.</w:t>
+              <w:t>TypeScript nos clientes e Python 3.13 no backend.</w:t>
+            </w:r>
+            <w:proofErr w:type="spellEnd"/>
+            <w:r>
+              <w:rPr>
+                <w:sz w:val="16"/>
+                <w:lang w:val="pt-BR"/>
+              </w:rPr>
             </w:r>
           </w:p>
         </w:tc>
@@ -14201,79 +14200,70 @@
                 <w:sz w:val="16"/>
                 <w:lang w:val="pt-BR"/>
               </w:rPr>
-              <w:t>React</w:t>
-            </w:r>
-            <w:proofErr w:type="spellEnd"/>
-            <w:r>
-              <w:rPr>
-                <w:sz w:val="16"/>
-                <w:lang w:val="pt-BR"/>
-              </w:rPr>
-              <w:t xml:space="preserve">, </w:t>
-            </w:r>
-            <w:proofErr w:type="spellStart"/>
-            <w:r>
-              <w:rPr>
-                <w:sz w:val="16"/>
-                <w:lang w:val="pt-BR"/>
-              </w:rPr>
-              <w:t>React</w:t>
-            </w:r>
-            <w:proofErr w:type="spellEnd"/>
-            <w:r>
-              <w:rPr>
-                <w:sz w:val="16"/>
-                <w:lang w:val="pt-BR"/>
-              </w:rPr>
-              <w:t xml:space="preserve"> </w:t>
-            </w:r>
-            <w:proofErr w:type="spellStart"/>
-            <w:r>
-              <w:rPr>
-                <w:sz w:val="16"/>
-                <w:lang w:val="pt-BR"/>
-              </w:rPr>
-              <w:t>Native</w:t>
-            </w:r>
-            <w:proofErr w:type="spellEnd"/>
-            <w:r>
-              <w:rPr>
-                <w:sz w:val="16"/>
-                <w:lang w:val="pt-BR"/>
-              </w:rPr>
-              <w:t xml:space="preserve">/Expo, </w:t>
-            </w:r>
-            <w:proofErr w:type="spellStart"/>
-            <w:r>
-              <w:rPr>
-                <w:sz w:val="16"/>
-                <w:lang w:val="pt-BR"/>
-              </w:rPr>
-              <w:t>FastAPI</w:t>
-            </w:r>
-            <w:proofErr w:type="spellEnd"/>
-            <w:r>
-              <w:rPr>
-                <w:sz w:val="16"/>
-                <w:lang w:val="pt-BR"/>
-              </w:rPr>
-              <w:t xml:space="preserve"> e PostgreSQL como </w:t>
-            </w:r>
-            <w:proofErr w:type="spellStart"/>
-            <w:r>
-              <w:rPr>
-                <w:sz w:val="16"/>
-                <w:lang w:val="pt-BR"/>
-              </w:rPr>
-              <w:t>stack</w:t>
-            </w:r>
-            <w:proofErr w:type="spellEnd"/>
-            <w:r>
-              <w:rPr>
-                <w:sz w:val="16"/>
-                <w:lang w:val="pt-BR"/>
-              </w:rPr>
-              <w:t xml:space="preserve"> principal; dependências auxiliares a definir.</w:t>
+              <w:t>React/Vite, React Native/Expo, FastAPI, SQLAlchemy, Alembic e PostgreSQL. Testes: pytest/pytest-cov e Vitest/V8; web também usa Testing Library.</w:t>
+            </w:r>
+            <w:proofErr w:type="spellEnd"/>
+            <w:r>
+              <w:rPr>
+                <w:sz w:val="16"/>
+                <w:lang w:val="pt-BR"/>
+              </w:rPr>
+            </w:r>
+            <w:proofErr w:type="spellStart"/>
+            <w:r>
+              <w:rPr>
+                <w:sz w:val="16"/>
+                <w:lang w:val="pt-BR"/>
+              </w:rPr>
+            </w:r>
+            <w:proofErr w:type="spellEnd"/>
+            <w:r>
+              <w:rPr>
+                <w:sz w:val="16"/>
+                <w:lang w:val="pt-BR"/>
+              </w:rPr>
+            </w:r>
+            <w:proofErr w:type="spellStart"/>
+            <w:r>
+              <w:rPr>
+                <w:sz w:val="16"/>
+                <w:lang w:val="pt-BR"/>
+              </w:rPr>
+            </w:r>
+            <w:proofErr w:type="spellEnd"/>
+            <w:r>
+              <w:rPr>
+                <w:sz w:val="16"/>
+                <w:lang w:val="pt-BR"/>
+              </w:rPr>
+            </w:r>
+            <w:proofErr w:type="spellStart"/>
+            <w:r>
+              <w:rPr>
+                <w:sz w:val="16"/>
+                <w:lang w:val="pt-BR"/>
+              </w:rPr>
+            </w:r>
+            <w:proofErr w:type="spellEnd"/>
+            <w:r>
+              <w:rPr>
+                <w:sz w:val="16"/>
+                <w:lang w:val="pt-BR"/>
+              </w:rPr>
+            </w:r>
+            <w:proofErr w:type="spellStart"/>
+            <w:r>
+              <w:rPr>
+                <w:sz w:val="16"/>
+                <w:lang w:val="pt-BR"/>
+              </w:rPr>
+            </w:r>
+            <w:proofErr w:type="spellEnd"/>
+            <w:r>
+              <w:rPr>
+                <w:sz w:val="16"/>
+                <w:lang w:val="pt-BR"/>
+              </w:rPr>
             </w:r>
           </w:p>
         </w:tc>
@@ -14314,49 +14304,43 @@
         <w:rPr>
           <w:lang w:val="pt-BR"/>
         </w:rPr>
-        <w:t xml:space="preserve">Estrutura proposta: web/ para interface </w:t>
+        <w:t>Estrutura implementada: backend/app/ reúne configuração, modelos, schemas, rotas e serviços de identidade; backend/migrations/ contém o esquema Alembic; backend/tests/ separa unidades e integração PostgreSQL. web/src/ contém páginas, componentes React e transporte por cookie. mobile/src/ contém telas React Native/Expo e transporte Bearer com SecureStore. Os contratos dos clientes seguem a API; documentação e evidências ficam em docs/.</w:t>
       </w:r>
       <w:proofErr w:type="spellStart"/>
       <w:r>
         <w:rPr>
           <w:lang w:val="pt-BR"/>
         </w:rPr>
-        <w:t>React</w:t>
       </w:r>
       <w:proofErr w:type="spellEnd"/>
       <w:r>
         <w:rPr>
           <w:lang w:val="pt-BR"/>
         </w:rPr>
-        <w:t xml:space="preserve">; mobile/ para aplicativo Expo; api/ com módulos de identidade, times, pareamento, partidas, eventos, corrida, rankings, quadras e mídia; </w:t>
       </w:r>
       <w:proofErr w:type="spellStart"/>
       <w:r>
         <w:rPr>
           <w:lang w:val="pt-BR"/>
         </w:rPr>
-        <w:t>migrations</w:t>
       </w:r>
       <w:proofErr w:type="spellEnd"/>
       <w:r>
         <w:rPr>
           <w:lang w:val="pt-BR"/>
         </w:rPr>
-        <w:t xml:space="preserve">/ para evolução do banco; </w:t>
       </w:r>
       <w:proofErr w:type="spellStart"/>
       <w:r>
         <w:rPr>
           <w:lang w:val="pt-BR"/>
         </w:rPr>
-        <w:t>tests</w:t>
       </w:r>
       <w:proofErr w:type="spellEnd"/>
       <w:r>
         <w:rPr>
           <w:lang w:val="pt-BR"/>
         </w:rPr>
-        <w:t>/ para testes unitários e de integração. A organização real e os caminhos do repositório serão registrados após a criação do código.</w:t>
       </w:r>
     </w:p>
     <w:p>
@@ -14582,35 +14566,31 @@
         <w:rPr>
           <w:lang w:val="pt-BR"/>
         </w:rPr>
-        <w:t xml:space="preserve">Padrões planejados: nomes consistentes e tipagem nos clientes; validação de entrada na API; separação entre controladores, regras de domínio e persistência; erros com mensagens úteis sem expor dados sensíveis; migrações </w:t>
+        <w:t>Padrões adotados: Ruff no Python (regras E, F e I; E501 desabilitada), ESLint e TypeScript nos clientes, validação e autorização no servidor, separação de responsabilidades, componentes reutilizáveis, erros sem dados sensíveis, migrações Alembic, dependências fixadas em arquivos de lock e controle de versão Git. AGENTS.md orienta alterações e atualização da fundação. O workflow .github/workflows/ci.yml executa checks, testes e coleta de cobertura.</w:t>
       </w:r>
       <w:proofErr w:type="spellStart"/>
       <w:r>
         <w:rPr>
           <w:lang w:val="pt-BR"/>
         </w:rPr>
-        <w:t>versionadas</w:t>
       </w:r>
       <w:proofErr w:type="spellEnd"/>
       <w:r>
         <w:rPr>
           <w:lang w:val="pt-BR"/>
         </w:rPr>
-        <w:t xml:space="preserve">; revisão de mudanças e </w:t>
       </w:r>
       <w:proofErr w:type="spellStart"/>
       <w:r>
         <w:rPr>
           <w:lang w:val="pt-BR"/>
         </w:rPr>
-        <w:t>commits</w:t>
       </w:r>
       <w:proofErr w:type="spellEnd"/>
       <w:r>
         <w:rPr>
           <w:lang w:val="pt-BR"/>
         </w:rPr>
-        <w:t xml:space="preserve"> coerentes. A adoção efetiva desses padrões será verificada no repositório.</w:t>
       </w:r>
     </w:p>
     <w:p>
@@ -14648,7 +14628,7 @@
         <w:rPr>
           <w:lang w:val="pt-BR"/>
         </w:rPr>
-        <w:t>Plano de testes unitários para cálculos e estados críticos. Os resultados esperados já estão definidos; nenhum caso foi executado nesta fase.</w:t>
+        <w:t>Testes locais executados em 9 de outubro de 2026: 52 casos unitários no backend, 18 na web e 12 no mobile, todos aprovados. O backend cobre idade, cadastro, hash de senha, autenticação, sessão, origem e validação de campos. A web cobre transporte, cadastro/login, recuperação de conexão e abas por teclado. O mobile cobre SecureStore, Bearer, respostas e timeout. Doubles isolam rede, banco e armazenamento nativo nos testes unitários; a integração real com PostgreSQL é testada separadamente. TU01 a TU06 abaixo continuam planejados para domínios futuros.</w:t>
       </w:r>
     </w:p>
     <w:tbl>
@@ -15909,42 +15889,37 @@
               <w:rPr>
                 <w:sz w:val="16"/>
               </w:rPr>
-              <w:t xml:space="preserve">0 — </w:t>
-            </w:r>
-            <w:proofErr w:type="spellStart"/>
-            <w:r>
-              <w:rPr>
-                <w:sz w:val="16"/>
-              </w:rPr>
-              <w:t>desenvolvimento</w:t>
-            </w:r>
-            <w:proofErr w:type="spellEnd"/>
-            <w:r>
-              <w:rPr>
-                <w:sz w:val="16"/>
-              </w:rPr>
-              <w:t xml:space="preserve"> </w:t>
-            </w:r>
-            <w:proofErr w:type="spellStart"/>
-            <w:r>
-              <w:rPr>
-                <w:sz w:val="16"/>
-              </w:rPr>
-              <w:t>não</w:t>
-            </w:r>
-            <w:proofErr w:type="spellEnd"/>
-            <w:r>
-              <w:rPr>
-                <w:sz w:val="16"/>
-              </w:rPr>
-              <w:t xml:space="preserve"> </w:t>
-            </w:r>
-            <w:proofErr w:type="spellStart"/>
-            <w:r>
-              <w:rPr>
-                <w:sz w:val="16"/>
-              </w:rPr>
-              <w:t>iniciado</w:t>
+              <w:t>82 casos unitários (backend 52, web 18, mobile 12); mais 8 de integração PostgreSQL.</w:t>
+            </w:r>
+            <w:proofErr w:type="spellStart"/>
+            <w:r>
+              <w:rPr>
+                <w:sz w:val="16"/>
+              </w:rPr>
+            </w:r>
+            <w:proofErr w:type="spellEnd"/>
+            <w:r>
+              <w:rPr>
+                <w:sz w:val="16"/>
+              </w:rPr>
+            </w:r>
+            <w:proofErr w:type="spellStart"/>
+            <w:r>
+              <w:rPr>
+                <w:sz w:val="16"/>
+              </w:rPr>
+            </w:r>
+            <w:proofErr w:type="spellEnd"/>
+            <w:r>
+              <w:rPr>
+                <w:sz w:val="16"/>
+              </w:rPr>
+            </w:r>
+            <w:proofErr w:type="spellStart"/>
+            <w:r>
+              <w:rPr>
+                <w:sz w:val="16"/>
+              </w:rPr>
             </w:r>
             <w:proofErr w:type="spellEnd"/>
           </w:p>
@@ -16006,49 +15981,43 @@
               <w:rPr>
                 <w:sz w:val="16"/>
               </w:rPr>
-              <w:t>Não</w:t>
-            </w:r>
-            <w:proofErr w:type="spellEnd"/>
-            <w:r>
-              <w:rPr>
-                <w:sz w:val="16"/>
-              </w:rPr>
-              <w:t xml:space="preserve"> </w:t>
-            </w:r>
-            <w:proofErr w:type="spellStart"/>
-            <w:r>
-              <w:rPr>
-                <w:sz w:val="16"/>
-              </w:rPr>
-              <w:t>aplicável</w:t>
-            </w:r>
-            <w:proofErr w:type="spellEnd"/>
-            <w:r>
-              <w:rPr>
-                <w:sz w:val="16"/>
-              </w:rPr>
-              <w:t xml:space="preserve"> </w:t>
-            </w:r>
-            <w:proofErr w:type="spellStart"/>
-            <w:r>
-              <w:rPr>
-                <w:sz w:val="16"/>
-              </w:rPr>
-              <w:t>nesta</w:t>
-            </w:r>
-            <w:proofErr w:type="spellEnd"/>
-            <w:r>
-              <w:rPr>
-                <w:sz w:val="16"/>
-              </w:rPr>
-              <w:t xml:space="preserve"> </w:t>
-            </w:r>
-            <w:proofErr w:type="spellStart"/>
-            <w:r>
-              <w:rPr>
-                <w:sz w:val="16"/>
-              </w:rPr>
-              <w:t>fase</w:t>
+              <w:t>82 unitários aprovados; 8 de integração aprovados.</w:t>
+            </w:r>
+            <w:proofErr w:type="spellEnd"/>
+            <w:r>
+              <w:rPr>
+                <w:sz w:val="16"/>
+              </w:rPr>
+            </w:r>
+            <w:proofErr w:type="spellStart"/>
+            <w:r>
+              <w:rPr>
+                <w:sz w:val="16"/>
+              </w:rPr>
+            </w:r>
+            <w:proofErr w:type="spellEnd"/>
+            <w:r>
+              <w:rPr>
+                <w:sz w:val="16"/>
+              </w:rPr>
+            </w:r>
+            <w:proofErr w:type="spellStart"/>
+            <w:r>
+              <w:rPr>
+                <w:sz w:val="16"/>
+              </w:rPr>
+            </w:r>
+            <w:proofErr w:type="spellEnd"/>
+            <w:r>
+              <w:rPr>
+                <w:sz w:val="16"/>
+              </w:rPr>
+            </w:r>
+            <w:proofErr w:type="spellStart"/>
+            <w:r>
+              <w:rPr>
+                <w:sz w:val="16"/>
+              </w:rPr>
             </w:r>
             <w:proofErr w:type="spellEnd"/>
           </w:p>
@@ -16110,49 +16079,43 @@
               <w:rPr>
                 <w:sz w:val="16"/>
               </w:rPr>
-              <w:t>Não</w:t>
-            </w:r>
-            <w:proofErr w:type="spellEnd"/>
-            <w:r>
-              <w:rPr>
-                <w:sz w:val="16"/>
-              </w:rPr>
-              <w:t xml:space="preserve"> </w:t>
-            </w:r>
-            <w:proofErr w:type="spellStart"/>
-            <w:r>
-              <w:rPr>
-                <w:sz w:val="16"/>
-              </w:rPr>
-              <w:t>aplicável</w:t>
-            </w:r>
-            <w:proofErr w:type="spellEnd"/>
-            <w:r>
-              <w:rPr>
-                <w:sz w:val="16"/>
-              </w:rPr>
-              <w:t xml:space="preserve"> </w:t>
-            </w:r>
-            <w:proofErr w:type="spellStart"/>
-            <w:r>
-              <w:rPr>
-                <w:sz w:val="16"/>
-              </w:rPr>
-              <w:t>nesta</w:t>
-            </w:r>
-            <w:proofErr w:type="spellEnd"/>
-            <w:r>
-              <w:rPr>
-                <w:sz w:val="16"/>
-              </w:rPr>
-              <w:t xml:space="preserve"> </w:t>
-            </w:r>
-            <w:proofErr w:type="spellStart"/>
-            <w:r>
-              <w:rPr>
-                <w:sz w:val="16"/>
-              </w:rPr>
-              <w:t>fase</w:t>
+              <w:t>0 falhas e 0 pulados.</w:t>
+            </w:r>
+            <w:proofErr w:type="spellEnd"/>
+            <w:r>
+              <w:rPr>
+                <w:sz w:val="16"/>
+              </w:rPr>
+            </w:r>
+            <w:proofErr w:type="spellStart"/>
+            <w:r>
+              <w:rPr>
+                <w:sz w:val="16"/>
+              </w:rPr>
+            </w:r>
+            <w:proofErr w:type="spellEnd"/>
+            <w:r>
+              <w:rPr>
+                <w:sz w:val="16"/>
+              </w:rPr>
+            </w:r>
+            <w:proofErr w:type="spellStart"/>
+            <w:r>
+              <w:rPr>
+                <w:sz w:val="16"/>
+              </w:rPr>
+            </w:r>
+            <w:proofErr w:type="spellEnd"/>
+            <w:r>
+              <w:rPr>
+                <w:sz w:val="16"/>
+              </w:rPr>
+            </w:r>
+            <w:proofErr w:type="spellStart"/>
+            <w:r>
+              <w:rPr>
+                <w:sz w:val="16"/>
+              </w:rPr>
             </w:r>
             <w:proofErr w:type="spellEnd"/>
           </w:p>
@@ -16214,21 +16177,19 @@
               <w:rPr>
                 <w:sz w:val="16"/>
               </w:rPr>
-              <w:t>Não</w:t>
-            </w:r>
-            <w:proofErr w:type="spellEnd"/>
-            <w:r>
-              <w:rPr>
-                <w:sz w:val="16"/>
-              </w:rPr>
-              <w:t xml:space="preserve"> </w:t>
-            </w:r>
-            <w:proofErr w:type="spellStart"/>
-            <w:r>
-              <w:rPr>
-                <w:sz w:val="16"/>
-              </w:rPr>
-              <w:t>calculável</w:t>
+              <w:t>100% em cada suíte. Sucesso = aprovados / executados.</w:t>
+            </w:r>
+            <w:proofErr w:type="spellEnd"/>
+            <w:r>
+              <w:rPr>
+                <w:sz w:val="16"/>
+              </w:rPr>
+            </w:r>
+            <w:proofErr w:type="spellStart"/>
+            <w:r>
+              <w:rPr>
+                <w:sz w:val="16"/>
+              </w:rPr>
             </w:r>
             <w:proofErr w:type="spellEnd"/>
           </w:p>
@@ -16301,7 +16262,7 @@
                 <w:sz w:val="16"/>
                 <w:lang w:val="pt-BR"/>
               </w:rPr>
-              <w:t>Não disponível; será medida quando houver código</w:t>
+              <w:t>Linhas: backend unidade 62,11%; backend unidade + integração 88,20%; web 35,02%; mobile 16,66%. Ramos: 47,83%; 71,74%; 34,69%; 8,91%, respectivamente.</w:t>
             </w:r>
           </w:p>
         </w:tc>
@@ -16340,21 +16301,19 @@
         <w:rPr>
           <w:lang w:val="pt-BR"/>
         </w:rPr>
-        <w:t xml:space="preserve">Evidências pendentes: saída do executor de testes, versão do código e relatório de cobertura quando disponível. Os cenários acima são </w:t>
+        <w:t>Evidências: testes versionados em backend/tests/unit/, backend/tests/integration/, web/tests/ e mobile/tests/. Relatórios locais em artifacts/coverage/: XML/JUnit do backend e JUnit, HTML, LCOV e JSON dos clientes. O CI está configurado para publicar relatórios e indicadores no resumo dos jobs; a execução remota desta atualização ainda não foi comprovada. Detalhes e comandos em docs/qualidade-codigo.md. Backend mede todo app; web mede src exceto main.tsx; mobile mede App.tsx e src, incluindo arquivos sem testes. Cobertura não comprova todos os comportamentos; telas nativas e partes da interface web ainda precisam de testes. Pisos iniciais: backend 60% em unidade e 85% na suíte completa para cobertura combinada de instruções/ramos; clientes têm pisos globais e por transporte da API registrados nas configurações Vitest.</w:t>
       </w:r>
       <w:proofErr w:type="gramStart"/>
       <w:r>
         <w:rPr>
           <w:lang w:val="pt-BR"/>
         </w:rPr>
-        <w:t>plano</w:t>
       </w:r>
       <w:proofErr w:type="gramEnd"/>
       <w:r>
         <w:rPr>
           <w:lang w:val="pt-BR"/>
         </w:rPr>
-        <w:t xml:space="preserve"> de teste, não resultados.</w:t>
       </w:r>
     </w:p>
     <w:p>
@@ -16518,21 +16477,19 @@
               <w:rPr>
                 <w:sz w:val="16"/>
               </w:rPr>
-              <w:t>Não</w:t>
-            </w:r>
-            <w:proofErr w:type="spellEnd"/>
-            <w:r>
-              <w:rPr>
-                <w:sz w:val="16"/>
-              </w:rPr>
-              <w:t xml:space="preserve"> </w:t>
-            </w:r>
-            <w:proofErr w:type="spellStart"/>
-            <w:r>
-              <w:rPr>
-                <w:sz w:val="16"/>
-              </w:rPr>
-              <w:t>iniciada</w:t>
+              <w:t>Fundação implementada; revisão visual atual aplicada à web. Mobile sem validação em aparelho nesta entrega.</w:t>
+            </w:r>
+            <w:proofErr w:type="spellEnd"/>
+            <w:r>
+              <w:rPr>
+                <w:sz w:val="16"/>
+              </w:rPr>
+            </w:r>
+            <w:proofErr w:type="spellStart"/>
+            <w:r>
+              <w:rPr>
+                <w:sz w:val="16"/>
+              </w:rPr>
             </w:r>
             <w:proofErr w:type="spellEnd"/>
           </w:p>
@@ -16619,7 +16576,7 @@
                 <w:sz w:val="16"/>
                 <w:lang w:val="pt-BR"/>
               </w:rPr>
-              <w:t>Planejadas: descobrir oportunidades, perfil, times e campeonatos, corrida e evolução, além dos fluxos de chat, quadras e inscrição.</w:t>
+              <w:t>Cadastro, login, conta e perfis privados nas duas interfaces. Web tem home, navegação e estados vazios para áreas futuras; não há dados de partidas ou ranking simulados.</w:t>
             </w:r>
           </w:p>
         </w:tc>
@@ -16819,14 +16776,13 @@
               <w:rPr>
                 <w:sz w:val="16"/>
               </w:rPr>
-              <w:t xml:space="preserve">PostgreSQL </w:t>
-            </w:r>
-            <w:proofErr w:type="spellStart"/>
-            <w:r>
-              <w:rPr>
-                <w:sz w:val="16"/>
-              </w:rPr>
-              <w:t>planejado</w:t>
+              <w:t>PostgreSQL 16.</w:t>
+            </w:r>
+            <w:proofErr w:type="spellStart"/>
+            <w:r>
+              <w:rPr>
+                <w:sz w:val="16"/>
+              </w:rPr>
             </w:r>
             <w:proofErr w:type="spellEnd"/>
           </w:p>
@@ -16896,21 +16852,19 @@
               <w:rPr>
                 <w:sz w:val="16"/>
               </w:rPr>
-              <w:t>Não</w:t>
-            </w:r>
-            <w:proofErr w:type="spellEnd"/>
-            <w:r>
-              <w:rPr>
-                <w:sz w:val="16"/>
-              </w:rPr>
-              <w:t xml:space="preserve"> </w:t>
-            </w:r>
-            <w:proofErr w:type="spellStart"/>
-            <w:r>
-              <w:rPr>
-                <w:sz w:val="16"/>
-              </w:rPr>
-              <w:t>iniciado</w:t>
+              <w:t>Esquema da fundação implementado: municípios, usuários, sessões e perfis esportivos.</w:t>
+            </w:r>
+            <w:proofErr w:type="spellEnd"/>
+            <w:r>
+              <w:rPr>
+                <w:sz w:val="16"/>
+              </w:rPr>
+            </w:r>
+            <w:proofErr w:type="spellStart"/>
+            <w:r>
+              <w:rPr>
+                <w:sz w:val="16"/>
+              </w:rPr>
             </w:r>
             <w:proofErr w:type="spellEnd"/>
           </w:p>
@@ -16971,7 +16925,7 @@
                 <w:sz w:val="16"/>
                 <w:lang w:val="pt-BR"/>
               </w:rPr>
-              <w:t>Pendente: repositório e diretório de migrações ainda inexistentes.</w:t>
+              <w:t>backend/migrations/; testes de integração executam em schema aleatório isolado.</w:t>
             </w:r>
           </w:p>
         </w:tc>
@@ -17010,7 +16964,7 @@
         <w:rPr>
           <w:lang w:val="pt-BR"/>
         </w:rPr>
-        <w:t>Planejamento: criar dados de demonstração fictícios para as três modalidades, com times e tenistas sem ranking e classificados, quadra aprovada e pendente, eventos gratuitos e pagos e marcas de corrida com origem distinta. Os dados reais de demonstração e scripts serão descritos após sua criação.</w:t>
+        <w:t>Dados da interface: conta e perfis consumidos da API; áreas futuras usam estados vazios. Não implementar moedas/carteira ou adicionar dados demonstrativos à interface sem nova solicitação. O seed opcional de desenvolvimento cria somente uma conta e perfis; não representa partidas, rankings ou eventos implementados.</w:t>
       </w:r>
     </w:p>
     <w:p>
@@ -22856,7 +22810,7 @@
               <w:rPr>
                 <w:sz w:val="16"/>
               </w:rPr>
-              <w:t>Não</w:t>
+              <w:t>Parcial</w:t>
             </w:r>
             <w:proofErr w:type="spellEnd"/>
           </w:p>
@@ -22881,7 +22835,7 @@
               <w:rPr>
                 <w:sz w:val="16"/>
               </w:rPr>
-              <w:t>Não</w:t>
+              <w:t>Sim, no escopo da fundação</w:t>
             </w:r>
             <w:proofErr w:type="spellEnd"/>
           </w:p>
@@ -22906,7 +22860,7 @@
               <w:rPr>
                 <w:sz w:val="16"/>
               </w:rPr>
-              <w:t>Planejado</w:t>
+              <w:t>Conta adulta, autenticação e perfis privados implementados e testados; papéis por vínculo permanecem planejados.</w:t>
             </w:r>
             <w:proofErr w:type="spellEnd"/>
           </w:p>

</xml_diff>

<commit_message>
docs: preenche as seções 3.3 e 3.4 do roteiro com telas e diagramas do banco
</commit_message>
<xml_diff>
--- a/docs/roteiro-projeto.docx
+++ b/docs/roteiro-projeto.docx
@@ -13053,13 +13053,17 @@
             <w:pPr>
               <w:spacing w:after="40"/>
               <w:jc w:val="center"/>
+              <w:rPr>
+                <w:lang w:val="pt-BR"/>
+              </w:rPr>
             </w:pPr>
             <w:r>
               <w:rPr>
                 <w:b/>
                 <w:sz w:val="16"/>
-              </w:rPr>
-              <w:t>Item</w:t>
+                <w:lang w:val="pt-BR"/>
+              </w:rPr>
+              <w:t xml:space="preserve">Item</w:t>
             </w:r>
           </w:p>
         </w:tc>
@@ -13079,13 +13083,17 @@
             <w:pPr>
               <w:spacing w:after="40"/>
               <w:jc w:val="center"/>
+              <w:rPr>
+                <w:lang w:val="pt-BR"/>
+              </w:rPr>
             </w:pPr>
             <w:r>
               <w:rPr>
                 <w:b/>
                 <w:sz w:val="16"/>
-              </w:rPr>
-              <w:t>Informação</w:t>
+                <w:lang w:val="pt-BR"/>
+              </w:rPr>
+              <w:t xml:space="preserve">Informação</w:t>
             </w:r>
           </w:p>
         </w:tc>
@@ -13109,10 +13117,14 @@
           <w:p>
             <w:pPr>
               <w:spacing w:after="40"/>
-            </w:pPr>
-            <w:r>
-              <w:rPr>
-                <w:sz w:val="16"/>
+              <w:rPr>
+                <w:lang w:val="pt-BR"/>
+              </w:rPr>
+            </w:pPr>
+            <w:r>
+              <w:rPr>
+                <w:sz w:val="16"/>
+                <w:lang w:val="pt-BR"/>
               </w:rPr>
               <w:t xml:space="preserve">Situação da implementação</w:t>
             </w:r>
@@ -13132,12 +13144,16 @@
           <w:p>
             <w:pPr>
               <w:spacing w:after="40"/>
-            </w:pPr>
-            <w:r>
-              <w:rPr>
-                <w:sz w:val="16"/>
-              </w:rPr>
-              <w:t>Fundação implementada; revisão visual atual aplicada à web. Mobile sem validação em aparelho nesta entrega.</w:t>
+              <w:rPr>
+                <w:lang w:val="pt-BR"/>
+              </w:rPr>
+            </w:pPr>
+            <w:r>
+              <w:rPr>
+                <w:sz w:val="16"/>
+                <w:lang w:val="pt-BR"/>
+              </w:rPr>
+              <w:t xml:space="preserve">Web e mobile implementados e integrados à mesma API FastAPI, com dados persistidos no PostgreSQL. A web foi conferida no navegador nos temas claro e escuro (prints abaixo). O Expo passou por lint, typecheck, testes automatizados e exportação Android, mas ainda não foi validado em aparelho físico.</w:t>
             </w:r>
           </w:p>
         </w:tc>
@@ -13161,10 +13177,105 @@
           <w:p>
             <w:pPr>
               <w:spacing w:after="40"/>
-            </w:pPr>
-            <w:r>
-              <w:rPr>
-                <w:sz w:val="16"/>
+              <w:rPr>
+                <w:lang w:val="pt-BR"/>
+              </w:rPr>
+            </w:pPr>
+            <w:r>
+              <w:rPr>
+                <w:sz w:val="16"/>
+                <w:lang w:val="pt-BR"/>
+              </w:rPr>
+              <w:t xml:space="preserve">Tecnologias de interface</w:t>
+            </w:r>
+          </w:p>
+        </w:tc>
+        <w:tc>
+          <w:tcPr>
+            <w:tcW w:w="5670" w:type="dxa"/>
+            <w:tcMar>
+              <w:top w:w="80" w:type="dxa"/>
+              <w:left w:w="80" w:type="dxa"/>
+              <w:bottom w:w="80" w:type="dxa"/>
+              <w:right w:w="80" w:type="dxa"/>
+            </w:tcMar>
+            <w:vAlign w:val="center"/>
+          </w:tcPr>
+          <w:p>
+            <w:pPr>
+              <w:spacing w:after="40"/>
+              <w:rPr>
+                <w:lang w:val="pt-BR"/>
+              </w:rPr>
+            </w:pPr>
+            <w:r>
+              <w:rPr>
+                <w:b/>
+                <w:sz w:val="16"/>
+                <w:lang w:val="pt-BR"/>
+              </w:rPr>
+              <w:t xml:space="preserve">Web:</w:t>
+            </w:r>
+            <w:r>
+              <w:rPr>
+                <w:sz w:val="16"/>
+                <w:lang w:val="pt-BR"/>
+              </w:rPr>
+              <w:t xml:space="preserve"> React 19, TypeScript, Vite 8 e Tailwind CSS 4; sessão em cookie HttpOnly.</w:t>
+            </w:r>
+          </w:p>
+          <w:p>
+            <w:pPr>
+              <w:spacing w:after="40"/>
+              <w:rPr>
+                <w:lang w:val="pt-BR"/>
+              </w:rPr>
+            </w:pPr>
+            <w:r>
+              <w:rPr>
+                <w:b/>
+                <w:sz w:val="16"/>
+                <w:lang w:val="pt-BR"/>
+              </w:rPr>
+              <w:t xml:space="preserve">Mobile:</w:t>
+            </w:r>
+            <w:r>
+              <w:rPr>
+                <w:sz w:val="16"/>
+                <w:lang w:val="pt-BR"/>
+              </w:rPr>
+              <w:t xml:space="preserve"> Expo 57 (React Native 0.86) com NativeWind; sessão Bearer guardada no SecureStore.</w:t>
+            </w:r>
+          </w:p>
+        </w:tc>
+      </w:tr>
+      <w:tr>
+        <w:trPr>
+          <w:cantSplit/>
+          <w:jc w:val="center"/>
+        </w:trPr>
+        <w:tc>
+          <w:tcPr>
+            <w:tcW w:w="3402" w:type="dxa"/>
+            <w:tcMar>
+              <w:top w:w="80" w:type="dxa"/>
+              <w:left w:w="80" w:type="dxa"/>
+              <w:bottom w:w="80" w:type="dxa"/>
+              <w:right w:w="80" w:type="dxa"/>
+            </w:tcMar>
+            <w:vAlign w:val="center"/>
+          </w:tcPr>
+          <w:p>
+            <w:pPr>
+              <w:spacing w:after="40"/>
+              <w:rPr>
+                <w:lang w:val="pt-BR"/>
+              </w:rPr>
+            </w:pPr>
+            <w:r>
+              <w:rPr>
+                <w:sz w:val="16"/>
+                <w:lang w:val="pt-BR"/>
               </w:rPr>
               <w:t xml:space="preserve">Principais telas implementadas</w:t>
             </w:r>
@@ -13190,10 +13301,1386 @@
             </w:pPr>
             <w:r>
               <w:rPr>
-                <w:sz w:val="16"/>
-                <w:lang w:val="pt-BR"/>
-              </w:rPr>
-              <w:t>Cadastro, login, conta e perfis privados nas duas interfaces. Web tem home, navegação e estados vazios para áreas futuras; não há dados de partidas ou ranking simulados.</w:t>
+                <w:b/>
+                <w:sz w:val="16"/>
+                <w:lang w:val="pt-BR"/>
+              </w:rPr>
+              <w:t xml:space="preserve">Entrada:</w:t>
+            </w:r>
+            <w:r>
+              <w:rPr>
+                <w:sz w:val="16"/>
+                <w:lang w:val="pt-BR"/>
+              </w:rPr>
+              <w:t xml:space="preserve"> login e cadastro de adultos.</w:t>
+            </w:r>
+          </w:p>
+          <w:p>
+            <w:pPr>
+              <w:spacing w:after="40"/>
+              <w:rPr>
+                <w:lang w:val="pt-BR"/>
+              </w:rPr>
+            </w:pPr>
+            <w:r>
+              <w:rPr>
+                <w:b/>
+                <w:sz w:val="16"/>
+                <w:lang w:val="pt-BR"/>
+              </w:rPr>
+              <w:t xml:space="preserve">Início:</w:t>
+            </w:r>
+            <w:r>
+              <w:rPr>
+                <w:sz w:val="16"/>
+                <w:lang w:val="pt-BR"/>
+              </w:rPr>
+              <w:t xml:space="preserve"> elo por modalidade, próxima partida e atalhos.</w:t>
+            </w:r>
+          </w:p>
+          <w:p>
+            <w:pPr>
+              <w:spacing w:after="40"/>
+              <w:rPr>
+                <w:lang w:val="pt-BR"/>
+              </w:rPr>
+            </w:pPr>
+            <w:r>
+              <w:rPr>
+                <w:b/>
+                <w:sz w:val="16"/>
+                <w:lang w:val="pt-BR"/>
+              </w:rPr>
+              <w:t xml:space="preserve">Jogar:</w:t>
+            </w:r>
+            <w:r>
+              <w:rPr>
+                <w:sz w:val="16"/>
+                <w:lang w:val="pt-BR"/>
+              </w:rPr>
+              <w:t xml:space="preserve"> busca de partida de futebol (com time ou avulso) e tênis por cidade e elo, proposta, chat, condições de horário e quadra, presença, placar e estatísticas; registro de treinos e provas de corrida.</w:t>
+            </w:r>
+          </w:p>
+          <w:p>
+            <w:pPr>
+              <w:spacing w:after="40"/>
+              <w:rPr>
+                <w:lang w:val="pt-BR"/>
+              </w:rPr>
+            </w:pPr>
+            <w:r>
+              <w:rPr>
+                <w:b/>
+                <w:sz w:val="16"/>
+                <w:lang w:val="pt-BR"/>
+              </w:rPr>
+              <w:t xml:space="preserve">Ranking:</w:t>
+            </w:r>
+            <w:r>
+              <w:rPr>
+                <w:sz w:val="16"/>
+                <w:lang w:val="pt-BR"/>
+              </w:rPr>
+              <w:t xml:space="preserve"> placa por elo, posição do usuário e Salão dos Lendários.</w:t>
+            </w:r>
+          </w:p>
+          <w:p>
+            <w:pPr>
+              <w:spacing w:after="40"/>
+              <w:rPr>
+                <w:lang w:val="pt-BR"/>
+              </w:rPr>
+            </w:pPr>
+            <w:r>
+              <w:rPr>
+                <w:b/>
+                <w:sz w:val="16"/>
+                <w:lang w:val="pt-BR"/>
+              </w:rPr>
+              <w:t xml:space="preserve">Times:</w:t>
+            </w:r>
+            <w:r>
+              <w:rPr>
+                <w:sz w:val="16"/>
+                <w:lang w:val="pt-BR"/>
+              </w:rPr>
+              <w:t xml:space="preserve"> carteirinha, elenco, convites e pedidos para entrar.</w:t>
+            </w:r>
+          </w:p>
+          <w:p>
+            <w:pPr>
+              <w:spacing w:after="40"/>
+              <w:rPr>
+                <w:lang w:val="pt-BR"/>
+              </w:rPr>
+            </w:pPr>
+            <w:r>
+              <w:rPr>
+                <w:b/>
+                <w:sz w:val="16"/>
+                <w:lang w:val="pt-BR"/>
+              </w:rPr>
+              <w:t xml:space="preserve">Campeonatos e provas:</w:t>
+            </w:r>
+            <w:r>
+              <w:rPr>
+                <w:sz w:val="16"/>
+                <w:lang w:val="pt-BR"/>
+              </w:rPr>
+              <w:t xml:space="preserve"> inscrição, comprovante de pagamento, chaveamento e gestão pelo organizador.</w:t>
+            </w:r>
+          </w:p>
+          <w:p>
+            <w:pPr>
+              <w:spacing w:after="40"/>
+              <w:rPr>
+                <w:lang w:val="pt-BR"/>
+              </w:rPr>
+            </w:pPr>
+            <w:r>
+              <w:rPr>
+                <w:b/>
+                <w:sz w:val="16"/>
+                <w:lang w:val="pt-BR"/>
+              </w:rPr>
+              <w:t xml:space="preserve">Notificações:</w:t>
+            </w:r>
+            <w:r>
+              <w:rPr>
+                <w:sz w:val="16"/>
+                <w:lang w:val="pt-BR"/>
+              </w:rPr>
+              <w:t xml:space="preserve"> pendências a responder e histórico com filtros.</w:t>
+            </w:r>
+          </w:p>
+          <w:p>
+            <w:pPr>
+              <w:spacing w:after="40"/>
+              <w:rPr>
+                <w:lang w:val="pt-BR"/>
+              </w:rPr>
+            </w:pPr>
+            <w:r>
+              <w:rPr>
+                <w:b/>
+                <w:sz w:val="16"/>
+                <w:lang w:val="pt-BR"/>
+              </w:rPr>
+              <w:t xml:space="preserve">Comunidade e perfil:</w:t>
+            </w:r>
+            <w:r>
+              <w:rPr>
+                <w:sz w:val="16"/>
+                <w:lang w:val="pt-BR"/>
+              </w:rPr>
+              <w:t xml:space="preserve"> publicações com foto, busca de atletas, seguir, perfil próprio e de outros atletas.</w:t>
+            </w:r>
+          </w:p>
+          <w:p>
+            <w:pPr>
+              <w:spacing w:after="40"/>
+              <w:rPr>
+                <w:lang w:val="pt-BR"/>
+              </w:rPr>
+            </w:pPr>
+            <w:r>
+              <w:rPr>
+                <w:b/>
+                <w:sz w:val="16"/>
+                <w:lang w:val="pt-BR"/>
+              </w:rPr>
+              <w:t xml:space="preserve">Menu:</w:t>
+            </w:r>
+            <w:r>
+              <w:rPr>
+                <w:sz w:val="16"/>
+                <w:lang w:val="pt-BR"/>
+              </w:rPr>
+              <w:t xml:space="preserve"> edição de conta, aparência clara/escura e painéis administrativos (organizadores, quadras, eventos pagos e disputas).</w:t>
+            </w:r>
+          </w:p>
+        </w:tc>
+      </w:tr>
+      <w:tr>
+        <w:trPr>
+          <w:cantSplit/>
+          <w:jc w:val="center"/>
+        </w:trPr>
+        <w:tc>
+          <w:tcPr>
+            <w:tcW w:w="3402" w:type="dxa"/>
+            <w:tcMar>
+              <w:top w:w="80" w:type="dxa"/>
+              <w:left w:w="80" w:type="dxa"/>
+              <w:bottom w:w="80" w:type="dxa"/>
+              <w:right w:w="80" w:type="dxa"/>
+            </w:tcMar>
+            <w:vAlign w:val="center"/>
+          </w:tcPr>
+          <w:p>
+            <w:pPr>
+              <w:spacing w:after="40"/>
+              <w:rPr>
+                <w:lang w:val="pt-BR"/>
+              </w:rPr>
+            </w:pPr>
+            <w:r>
+              <w:rPr>
+                <w:sz w:val="16"/>
+                <w:lang w:val="pt-BR"/>
+              </w:rPr>
+              <w:t xml:space="preserve">Navegação</w:t>
+            </w:r>
+          </w:p>
+        </w:tc>
+        <w:tc>
+          <w:tcPr>
+            <w:tcW w:w="5670" w:type="dxa"/>
+            <w:tcMar>
+              <w:top w:w="80" w:type="dxa"/>
+              <w:left w:w="80" w:type="dxa"/>
+              <w:bottom w:w="80" w:type="dxa"/>
+              <w:right w:w="80" w:type="dxa"/>
+            </w:tcMar>
+            <w:vAlign w:val="center"/>
+          </w:tcPr>
+          <w:p>
+            <w:pPr>
+              <w:spacing w:after="40"/>
+              <w:rPr>
+                <w:lang w:val="pt-BR"/>
+              </w:rPr>
+            </w:pPr>
+            <w:r>
+              <w:rPr>
+                <w:sz w:val="16"/>
+                <w:lang w:val="pt-BR"/>
+              </w:rPr>
+              <w:t xml:space="preserve">Barra inferior com cinco abas raiz (Início, Ranking, JOGAR, Comunidade e Perfil), com o sino de notificações em cada aba raiz.</w:t>
+            </w:r>
+          </w:p>
+        </w:tc>
+      </w:tr>
+      <w:tr>
+        <w:trPr>
+          <w:cantSplit/>
+          <w:jc w:val="center"/>
+        </w:trPr>
+        <w:tc>
+          <w:tcPr>
+            <w:tcW w:w="3402" w:type="dxa"/>
+            <w:tcMar>
+              <w:top w:w="80" w:type="dxa"/>
+              <w:left w:w="80" w:type="dxa"/>
+              <w:bottom w:w="80" w:type="dxa"/>
+              <w:right w:w="80" w:type="dxa"/>
+            </w:tcMar>
+            <w:vAlign w:val="center"/>
+          </w:tcPr>
+          <w:p>
+            <w:pPr>
+              <w:spacing w:after="40"/>
+              <w:rPr>
+                <w:lang w:val="pt-BR"/>
+              </w:rPr>
+            </w:pPr>
+            <w:r>
+              <w:rPr>
+                <w:sz w:val="16"/>
+                <w:lang w:val="pt-BR"/>
+              </w:rPr>
+              <w:t xml:space="preserve">Acessibilidade e estados</w:t>
+            </w:r>
+          </w:p>
+        </w:tc>
+        <w:tc>
+          <w:tcPr>
+            <w:tcW w:w="5670" w:type="dxa"/>
+            <w:tcMar>
+              <w:top w:w="80" w:type="dxa"/>
+              <w:left w:w="80" w:type="dxa"/>
+              <w:bottom w:w="80" w:type="dxa"/>
+              <w:right w:w="80" w:type="dxa"/>
+            </w:tcMar>
+            <w:vAlign w:val="center"/>
+          </w:tcPr>
+          <w:p>
+            <w:pPr>
+              <w:spacing w:after="40"/>
+              <w:rPr>
+                <w:lang w:val="pt-BR"/>
+              </w:rPr>
+            </w:pPr>
+            <w:r>
+              <w:rPr>
+                <w:sz w:val="16"/>
+                <w:lang w:val="pt-BR"/>
+              </w:rPr>
+              <w:t xml:space="preserve">Rótulos nos campos, foco visível, navegação por teclado e atalho "Pular para conteúdo" na web. Estados de carregamento, vazio, erro e sucesso, com avisos por toast e faixa de conexão.</w:t>
+            </w:r>
+          </w:p>
+        </w:tc>
+      </w:tr>
+      <w:tr>
+        <w:trPr>
+          <w:cantSplit/>
+          <w:jc w:val="center"/>
+        </w:trPr>
+        <w:tc>
+          <w:tcPr>
+            <w:tcW w:w="3402" w:type="dxa"/>
+            <w:tcMar>
+              <w:top w:w="80" w:type="dxa"/>
+              <w:left w:w="80" w:type="dxa"/>
+              <w:bottom w:w="80" w:type="dxa"/>
+              <w:right w:w="80" w:type="dxa"/>
+            </w:tcMar>
+            <w:vAlign w:val="center"/>
+          </w:tcPr>
+          <w:p>
+            <w:pPr>
+              <w:spacing w:after="40"/>
+              <w:rPr>
+                <w:lang w:val="pt-BR"/>
+              </w:rPr>
+            </w:pPr>
+            <w:r>
+              <w:rPr>
+                <w:sz w:val="16"/>
+                <w:lang w:val="pt-BR"/>
+              </w:rPr>
+              <w:t xml:space="preserve">Evidências</w:t>
+            </w:r>
+          </w:p>
+        </w:tc>
+        <w:tc>
+          <w:tcPr>
+            <w:tcW w:w="5670" w:type="dxa"/>
+            <w:tcMar>
+              <w:top w:w="80" w:type="dxa"/>
+              <w:left w:w="80" w:type="dxa"/>
+              <w:bottom w:w="80" w:type="dxa"/>
+              <w:right w:w="80" w:type="dxa"/>
+            </w:tcMar>
+            <w:vAlign w:val="center"/>
+          </w:tcPr>
+          <w:p>
+            <w:pPr>
+              <w:spacing w:after="40"/>
+              <w:rPr>
+                <w:lang w:val="pt-BR"/>
+              </w:rPr>
+            </w:pPr>
+            <w:r>
+              <w:rPr>
+                <w:sz w:val="16"/>
+                <w:lang w:val="pt-BR"/>
+              </w:rPr>
+              <w:t xml:space="preserve">Prints capturados em 23/10/2026 com Playwright (Chromium, 390 × 844 px) na web, com a conta de demonstração Lucas Andrade. Contas, times, partidas, resultados e inscrições foram criados pelos fluxos da API num banco isolado de demonstração; nenhuma tela usa dados fixos no código. Nesse banco, os cortes dos elos foram reduzidos e as quadras inseridas por SQL para encurtar o roteiro de demonstração.</w:t>
+            </w:r>
+          </w:p>
+        </w:tc>
+      </w:tr>
+    </w:tbl>
+    <w:p>
+      <w:pPr>
+        <w:spacing w:after="0"/>
+        <w:rPr>
+          <w:lang w:val="pt-BR"/>
+        </w:rPr>
+      </w:pPr>
+    </w:p>
+    <w:p>
+      <w:pPr>
+        <w:keepNext/>
+        <w:spacing w:after="80"/>
+        <w:rPr>
+          <w:lang w:val="pt-BR"/>
+        </w:rPr>
+      </w:pPr>
+      <w:r>
+        <w:rPr>
+          <w:b/>
+          <w:lang w:val="pt-BR"/>
+        </w:rPr>
+        <w:t xml:space="preserve">Telas da aplicação web em execução</w:t>
+      </w:r>
+    </w:p>
+    <w:tbl>
+      <w:tblPr>
+        <w:tblW w:w="9689" w:type="dxa"/>
+        <w:jc w:val="center"/>
+        <w:tblBorders>
+          <w:top w:val="nil"/>
+          <w:left w:val="nil"/>
+          <w:bottom w:val="nil"/>
+          <w:right w:val="nil"/>
+          <w:insideH w:val="nil"/>
+          <w:insideV w:val="nil"/>
+        </w:tblBorders>
+        <w:tblLayout w:type="fixed"/>
+      </w:tblPr>
+      <w:tblGrid>
+        <w:gridCol w:w="3229"/>
+        <w:gridCol w:w="3229"/>
+        <w:gridCol w:w="3229"/>
+      </w:tblGrid>
+      <w:tr>
+        <w:trPr>
+          <w:cantSplit/>
+          <w:jc w:val="center"/>
+        </w:trPr>
+        <w:tc>
+          <w:tcPr>
+            <w:tcW w:w="3229" w:type="dxa"/>
+            <w:tcMar>
+              <w:top w:w="80" w:type="dxa"/>
+              <w:left w:w="80" w:type="dxa"/>
+              <w:bottom w:w="80" w:type="dxa"/>
+              <w:right w:w="80" w:type="dxa"/>
+            </w:tcMar>
+          </w:tcPr>
+          <w:p>
+            <w:pPr>
+              <w:keepNext/>
+              <w:spacing w:after="40"/>
+              <w:jc w:val="center"/>
+              <w:rPr>
+                <w:lang w:val="pt-BR"/>
+              </w:rPr>
+            </w:pPr>
+            <w:r>
+              <w:rPr>
+                <w:noProof/>
+              </w:rPr>
+              <w:drawing>
+                <wp:inline distT="0" distB="0" distL="0" distR="0">
+                  <wp:extent cx="1682750" cy="3641644"/>
+                  <wp:effectExtent l="0" t="0" r="0" b="0"/>
+                  <wp:docPr id="910001" name="01-entrada.png" descr="Entrada: login e cadastro"/>
+                  <wp:cNvGraphicFramePr>
+                    <a:graphicFrameLocks xmlns:a="http://schemas.openxmlformats.org/drawingml/2006/main" noChangeAspect="1"/>
+                  </wp:cNvGraphicFramePr>
+                  <a:graphic xmlns:a="http://schemas.openxmlformats.org/drawingml/2006/main">
+                    <a:graphicData uri="http://schemas.openxmlformats.org/drawingml/2006/picture">
+                      <pic:pic xmlns:pic="http://schemas.openxmlformats.org/drawingml/2006/picture">
+                        <pic:nvPicPr>
+                          <pic:cNvPr id="0" name="01-entrada.png"/>
+                          <pic:cNvPicPr/>
+                        </pic:nvPicPr>
+                        <pic:blipFill>
+                          <a:blip r:embed="rIdRot1"/>
+                          <a:stretch>
+                            <a:fillRect/>
+                          </a:stretch>
+                        </pic:blipFill>
+                        <pic:spPr>
+                          <a:xfrm>
+                            <a:off x="0" y="0"/>
+                            <a:ext cx="1682750" cy="3641644"/>
+                          </a:xfrm>
+                          <a:prstGeom prst="rect">
+                            <a:avLst/>
+                          </a:prstGeom>
+                        </pic:spPr>
+                      </pic:pic>
+                    </a:graphicData>
+                  </a:graphic>
+                </wp:inline>
+              </w:drawing>
+            </w:r>
+          </w:p>
+          <w:p>
+            <w:pPr>
+              <w:spacing w:after="120"/>
+              <w:jc w:val="center"/>
+              <w:rPr>
+                <w:lang w:val="pt-BR"/>
+              </w:rPr>
+            </w:pPr>
+            <w:r>
+              <w:rPr>
+                <w:i/>
+                <w:sz w:val="16"/>
+                <w:lang w:val="pt-BR"/>
+              </w:rPr>
+              <w:t xml:space="preserve">Entrada: login e cadastro</w:t>
+            </w:r>
+          </w:p>
+        </w:tc>
+        <w:tc>
+          <w:tcPr>
+            <w:tcW w:w="3229" w:type="dxa"/>
+            <w:tcMar>
+              <w:top w:w="80" w:type="dxa"/>
+              <w:left w:w="80" w:type="dxa"/>
+              <w:bottom w:w="80" w:type="dxa"/>
+              <w:right w:w="80" w:type="dxa"/>
+            </w:tcMar>
+          </w:tcPr>
+          <w:p>
+            <w:pPr>
+              <w:keepNext/>
+              <w:spacing w:after="40"/>
+              <w:jc w:val="center"/>
+              <w:rPr>
+                <w:lang w:val="pt-BR"/>
+              </w:rPr>
+            </w:pPr>
+            <w:r>
+              <w:rPr>
+                <w:noProof/>
+              </w:rPr>
+              <w:drawing>
+                <wp:inline distT="0" distB="0" distL="0" distR="0">
+                  <wp:extent cx="1682750" cy="3641644"/>
+                  <wp:effectExtent l="0" t="0" r="0" b="0"/>
+                  <wp:docPr id="910002" name="02-inicio.png" descr="Início: elo por modalidade"/>
+                  <wp:cNvGraphicFramePr>
+                    <a:graphicFrameLocks xmlns:a="http://schemas.openxmlformats.org/drawingml/2006/main" noChangeAspect="1"/>
+                  </wp:cNvGraphicFramePr>
+                  <a:graphic xmlns:a="http://schemas.openxmlformats.org/drawingml/2006/main">
+                    <a:graphicData uri="http://schemas.openxmlformats.org/drawingml/2006/picture">
+                      <pic:pic xmlns:pic="http://schemas.openxmlformats.org/drawingml/2006/picture">
+                        <pic:nvPicPr>
+                          <pic:cNvPr id="0" name="02-inicio.png"/>
+                          <pic:cNvPicPr/>
+                        </pic:nvPicPr>
+                        <pic:blipFill>
+                          <a:blip r:embed="rIdRot2"/>
+                          <a:stretch>
+                            <a:fillRect/>
+                          </a:stretch>
+                        </pic:blipFill>
+                        <pic:spPr>
+                          <a:xfrm>
+                            <a:off x="0" y="0"/>
+                            <a:ext cx="1682750" cy="3641644"/>
+                          </a:xfrm>
+                          <a:prstGeom prst="rect">
+                            <a:avLst/>
+                          </a:prstGeom>
+                        </pic:spPr>
+                      </pic:pic>
+                    </a:graphicData>
+                  </a:graphic>
+                </wp:inline>
+              </w:drawing>
+            </w:r>
+          </w:p>
+          <w:p>
+            <w:pPr>
+              <w:spacing w:after="120"/>
+              <w:jc w:val="center"/>
+              <w:rPr>
+                <w:lang w:val="pt-BR"/>
+              </w:rPr>
+            </w:pPr>
+            <w:r>
+              <w:rPr>
+                <w:i/>
+                <w:sz w:val="16"/>
+                <w:lang w:val="pt-BR"/>
+              </w:rPr>
+              <w:t xml:space="preserve">Início: elo por modalidade</w:t>
+            </w:r>
+          </w:p>
+        </w:tc>
+        <w:tc>
+          <w:tcPr>
+            <w:tcW w:w="3229" w:type="dxa"/>
+            <w:tcMar>
+              <w:top w:w="80" w:type="dxa"/>
+              <w:left w:w="80" w:type="dxa"/>
+              <w:bottom w:w="80" w:type="dxa"/>
+              <w:right w:w="80" w:type="dxa"/>
+            </w:tcMar>
+          </w:tcPr>
+          <w:p>
+            <w:pPr>
+              <w:keepNext/>
+              <w:spacing w:after="40"/>
+              <w:jc w:val="center"/>
+              <w:rPr>
+                <w:lang w:val="pt-BR"/>
+              </w:rPr>
+            </w:pPr>
+            <w:r>
+              <w:rPr>
+                <w:noProof/>
+              </w:rPr>
+              <w:drawing>
+                <wp:inline distT="0" distB="0" distL="0" distR="0">
+                  <wp:extent cx="1682750" cy="3641644"/>
+                  <wp:effectExtent l="0" t="0" r="0" b="0"/>
+                  <wp:docPr id="910003" name="03-jogar.png" descr="Jogar: futebol com meu time"/>
+                  <wp:cNvGraphicFramePr>
+                    <a:graphicFrameLocks xmlns:a="http://schemas.openxmlformats.org/drawingml/2006/main" noChangeAspect="1"/>
+                  </wp:cNvGraphicFramePr>
+                  <a:graphic xmlns:a="http://schemas.openxmlformats.org/drawingml/2006/main">
+                    <a:graphicData uri="http://schemas.openxmlformats.org/drawingml/2006/picture">
+                      <pic:pic xmlns:pic="http://schemas.openxmlformats.org/drawingml/2006/picture">
+                        <pic:nvPicPr>
+                          <pic:cNvPr id="0" name="03-jogar.png"/>
+                          <pic:cNvPicPr/>
+                        </pic:nvPicPr>
+                        <pic:blipFill>
+                          <a:blip r:embed="rIdRot3"/>
+                          <a:stretch>
+                            <a:fillRect/>
+                          </a:stretch>
+                        </pic:blipFill>
+                        <pic:spPr>
+                          <a:xfrm>
+                            <a:off x="0" y="0"/>
+                            <a:ext cx="1682750" cy="3641644"/>
+                          </a:xfrm>
+                          <a:prstGeom prst="rect">
+                            <a:avLst/>
+                          </a:prstGeom>
+                        </pic:spPr>
+                      </pic:pic>
+                    </a:graphicData>
+                  </a:graphic>
+                </wp:inline>
+              </w:drawing>
+            </w:r>
+          </w:p>
+          <w:p>
+            <w:pPr>
+              <w:spacing w:after="120"/>
+              <w:jc w:val="center"/>
+              <w:rPr>
+                <w:lang w:val="pt-BR"/>
+              </w:rPr>
+            </w:pPr>
+            <w:r>
+              <w:rPr>
+                <w:i/>
+                <w:sz w:val="16"/>
+                <w:lang w:val="pt-BR"/>
+              </w:rPr>
+              <w:t xml:space="preserve">Jogar: futebol com meu time</w:t>
+            </w:r>
+          </w:p>
+        </w:tc>
+      </w:tr>
+      <w:tr>
+        <w:trPr>
+          <w:cantSplit/>
+          <w:jc w:val="center"/>
+        </w:trPr>
+        <w:tc>
+          <w:tcPr>
+            <w:tcW w:w="3229" w:type="dxa"/>
+            <w:tcMar>
+              <w:top w:w="80" w:type="dxa"/>
+              <w:left w:w="80" w:type="dxa"/>
+              <w:bottom w:w="80" w:type="dxa"/>
+              <w:right w:w="80" w:type="dxa"/>
+            </w:tcMar>
+          </w:tcPr>
+          <w:p>
+            <w:pPr>
+              <w:keepNext/>
+              <w:spacing w:after="40"/>
+              <w:jc w:val="center"/>
+              <w:rPr>
+                <w:lang w:val="pt-BR"/>
+              </w:rPr>
+            </w:pPr>
+            <w:r>
+              <w:rPr>
+                <w:noProof/>
+              </w:rPr>
+              <w:drawing>
+                <wp:inline distT="0" distB="0" distL="0" distR="0">
+                  <wp:extent cx="1682750" cy="3641644"/>
+                  <wp:effectExtent l="0" t="0" r="0" b="0"/>
+                  <wp:docPr id="910004" name="04-partida.png" descr="Partida: placar confirmado e chat"/>
+                  <wp:cNvGraphicFramePr>
+                    <a:graphicFrameLocks xmlns:a="http://schemas.openxmlformats.org/drawingml/2006/main" noChangeAspect="1"/>
+                  </wp:cNvGraphicFramePr>
+                  <a:graphic xmlns:a="http://schemas.openxmlformats.org/drawingml/2006/main">
+                    <a:graphicData uri="http://schemas.openxmlformats.org/drawingml/2006/picture">
+                      <pic:pic xmlns:pic="http://schemas.openxmlformats.org/drawingml/2006/picture">
+                        <pic:nvPicPr>
+                          <pic:cNvPr id="0" name="04-partida.png"/>
+                          <pic:cNvPicPr/>
+                        </pic:nvPicPr>
+                        <pic:blipFill>
+                          <a:blip r:embed="rIdRot4"/>
+                          <a:stretch>
+                            <a:fillRect/>
+                          </a:stretch>
+                        </pic:blipFill>
+                        <pic:spPr>
+                          <a:xfrm>
+                            <a:off x="0" y="0"/>
+                            <a:ext cx="1682750" cy="3641644"/>
+                          </a:xfrm>
+                          <a:prstGeom prst="rect">
+                            <a:avLst/>
+                          </a:prstGeom>
+                        </pic:spPr>
+                      </pic:pic>
+                    </a:graphicData>
+                  </a:graphic>
+                </wp:inline>
+              </w:drawing>
+            </w:r>
+          </w:p>
+          <w:p>
+            <w:pPr>
+              <w:spacing w:after="120"/>
+              <w:jc w:val="center"/>
+              <w:rPr>
+                <w:lang w:val="pt-BR"/>
+              </w:rPr>
+            </w:pPr>
+            <w:r>
+              <w:rPr>
+                <w:i/>
+                <w:sz w:val="16"/>
+                <w:lang w:val="pt-BR"/>
+              </w:rPr>
+              <w:t xml:space="preserve">Partida: placar confirmado e chat</w:t>
+            </w:r>
+          </w:p>
+        </w:tc>
+        <w:tc>
+          <w:tcPr>
+            <w:tcW w:w="3229" w:type="dxa"/>
+            <w:tcMar>
+              <w:top w:w="80" w:type="dxa"/>
+              <w:left w:w="80" w:type="dxa"/>
+              <w:bottom w:w="80" w:type="dxa"/>
+              <w:right w:w="80" w:type="dxa"/>
+            </w:tcMar>
+          </w:tcPr>
+          <w:p>
+            <w:pPr>
+              <w:keepNext/>
+              <w:spacing w:after="40"/>
+              <w:jc w:val="center"/>
+              <w:rPr>
+                <w:lang w:val="pt-BR"/>
+              </w:rPr>
+            </w:pPr>
+            <w:r>
+              <w:rPr>
+                <w:noProof/>
+              </w:rPr>
+              <w:drawing>
+                <wp:inline distT="0" distB="0" distL="0" distR="0">
+                  <wp:extent cx="1682750" cy="3641644"/>
+                  <wp:effectExtent l="0" t="0" r="0" b="0"/>
+                  <wp:docPr id="910005" name="05-corrida.png" descr="Jogar: corrida e marcas"/>
+                  <wp:cNvGraphicFramePr>
+                    <a:graphicFrameLocks xmlns:a="http://schemas.openxmlformats.org/drawingml/2006/main" noChangeAspect="1"/>
+                  </wp:cNvGraphicFramePr>
+                  <a:graphic xmlns:a="http://schemas.openxmlformats.org/drawingml/2006/main">
+                    <a:graphicData uri="http://schemas.openxmlformats.org/drawingml/2006/picture">
+                      <pic:pic xmlns:pic="http://schemas.openxmlformats.org/drawingml/2006/picture">
+                        <pic:nvPicPr>
+                          <pic:cNvPr id="0" name="05-corrida.png"/>
+                          <pic:cNvPicPr/>
+                        </pic:nvPicPr>
+                        <pic:blipFill>
+                          <a:blip r:embed="rIdRot5"/>
+                          <a:stretch>
+                            <a:fillRect/>
+                          </a:stretch>
+                        </pic:blipFill>
+                        <pic:spPr>
+                          <a:xfrm>
+                            <a:off x="0" y="0"/>
+                            <a:ext cx="1682750" cy="3641644"/>
+                          </a:xfrm>
+                          <a:prstGeom prst="rect">
+                            <a:avLst/>
+                          </a:prstGeom>
+                        </pic:spPr>
+                      </pic:pic>
+                    </a:graphicData>
+                  </a:graphic>
+                </wp:inline>
+              </w:drawing>
+            </w:r>
+          </w:p>
+          <w:p>
+            <w:pPr>
+              <w:spacing w:after="120"/>
+              <w:jc w:val="center"/>
+              <w:rPr>
+                <w:lang w:val="pt-BR"/>
+              </w:rPr>
+            </w:pPr>
+            <w:r>
+              <w:rPr>
+                <w:i/>
+                <w:sz w:val="16"/>
+                <w:lang w:val="pt-BR"/>
+              </w:rPr>
+              <w:t xml:space="preserve">Jogar: corrida e marcas</w:t>
+            </w:r>
+          </w:p>
+        </w:tc>
+        <w:tc>
+          <w:tcPr>
+            <w:tcW w:w="3229" w:type="dxa"/>
+            <w:tcMar>
+              <w:top w:w="80" w:type="dxa"/>
+              <w:left w:w="80" w:type="dxa"/>
+              <w:bottom w:w="80" w:type="dxa"/>
+              <w:right w:w="80" w:type="dxa"/>
+            </w:tcMar>
+          </w:tcPr>
+          <w:p>
+            <w:pPr>
+              <w:keepNext/>
+              <w:spacing w:after="40"/>
+              <w:jc w:val="center"/>
+              <w:rPr>
+                <w:lang w:val="pt-BR"/>
+              </w:rPr>
+            </w:pPr>
+            <w:r>
+              <w:rPr>
+                <w:noProof/>
+              </w:rPr>
+              <w:drawing>
+                <wp:inline distT="0" distB="0" distL="0" distR="0">
+                  <wp:extent cx="1682750" cy="3641644"/>
+                  <wp:effectExtent l="0" t="0" r="0" b="0"/>
+                  <wp:docPr id="910006" name="06-ranking.png" descr="Ranking por elo"/>
+                  <wp:cNvGraphicFramePr>
+                    <a:graphicFrameLocks xmlns:a="http://schemas.openxmlformats.org/drawingml/2006/main" noChangeAspect="1"/>
+                  </wp:cNvGraphicFramePr>
+                  <a:graphic xmlns:a="http://schemas.openxmlformats.org/drawingml/2006/main">
+                    <a:graphicData uri="http://schemas.openxmlformats.org/drawingml/2006/picture">
+                      <pic:pic xmlns:pic="http://schemas.openxmlformats.org/drawingml/2006/picture">
+                        <pic:nvPicPr>
+                          <pic:cNvPr id="0" name="06-ranking.png"/>
+                          <pic:cNvPicPr/>
+                        </pic:nvPicPr>
+                        <pic:blipFill>
+                          <a:blip r:embed="rIdRot6"/>
+                          <a:stretch>
+                            <a:fillRect/>
+                          </a:stretch>
+                        </pic:blipFill>
+                        <pic:spPr>
+                          <a:xfrm>
+                            <a:off x="0" y="0"/>
+                            <a:ext cx="1682750" cy="3641644"/>
+                          </a:xfrm>
+                          <a:prstGeom prst="rect">
+                            <a:avLst/>
+                          </a:prstGeom>
+                        </pic:spPr>
+                      </pic:pic>
+                    </a:graphicData>
+                  </a:graphic>
+                </wp:inline>
+              </w:drawing>
+            </w:r>
+          </w:p>
+          <w:p>
+            <w:pPr>
+              <w:spacing w:after="120"/>
+              <w:jc w:val="center"/>
+              <w:rPr>
+                <w:lang w:val="pt-BR"/>
+              </w:rPr>
+            </w:pPr>
+            <w:r>
+              <w:rPr>
+                <w:i/>
+                <w:sz w:val="16"/>
+                <w:lang w:val="pt-BR"/>
+              </w:rPr>
+              <w:t xml:space="preserve">Ranking por elo</w:t>
+            </w:r>
+          </w:p>
+        </w:tc>
+      </w:tr>
+      <w:tr>
+        <w:trPr>
+          <w:cantSplit/>
+          <w:jc w:val="center"/>
+        </w:trPr>
+        <w:tc>
+          <w:tcPr>
+            <w:tcW w:w="3229" w:type="dxa"/>
+            <w:tcMar>
+              <w:top w:w="80" w:type="dxa"/>
+              <w:left w:w="80" w:type="dxa"/>
+              <w:bottom w:w="80" w:type="dxa"/>
+              <w:right w:w="80" w:type="dxa"/>
+            </w:tcMar>
+          </w:tcPr>
+          <w:p>
+            <w:pPr>
+              <w:keepNext/>
+              <w:spacing w:after="40"/>
+              <w:jc w:val="center"/>
+              <w:rPr>
+                <w:lang w:val="pt-BR"/>
+              </w:rPr>
+            </w:pPr>
+            <w:r>
+              <w:rPr>
+                <w:noProof/>
+              </w:rPr>
+              <w:drawing>
+                <wp:inline distT="0" distB="0" distL="0" distR="0">
+                  <wp:extent cx="1682750" cy="3641644"/>
+                  <wp:effectExtent l="0" t="0" r="0" b="0"/>
+                  <wp:docPr id="910007" name="07-time.png" descr="Meus times: carteirinha e elenco"/>
+                  <wp:cNvGraphicFramePr>
+                    <a:graphicFrameLocks xmlns:a="http://schemas.openxmlformats.org/drawingml/2006/main" noChangeAspect="1"/>
+                  </wp:cNvGraphicFramePr>
+                  <a:graphic xmlns:a="http://schemas.openxmlformats.org/drawingml/2006/main">
+                    <a:graphicData uri="http://schemas.openxmlformats.org/drawingml/2006/picture">
+                      <pic:pic xmlns:pic="http://schemas.openxmlformats.org/drawingml/2006/picture">
+                        <pic:nvPicPr>
+                          <pic:cNvPr id="0" name="07-time.png"/>
+                          <pic:cNvPicPr/>
+                        </pic:nvPicPr>
+                        <pic:blipFill>
+                          <a:blip r:embed="rIdRot7"/>
+                          <a:stretch>
+                            <a:fillRect/>
+                          </a:stretch>
+                        </pic:blipFill>
+                        <pic:spPr>
+                          <a:xfrm>
+                            <a:off x="0" y="0"/>
+                            <a:ext cx="1682750" cy="3641644"/>
+                          </a:xfrm>
+                          <a:prstGeom prst="rect">
+                            <a:avLst/>
+                          </a:prstGeom>
+                        </pic:spPr>
+                      </pic:pic>
+                    </a:graphicData>
+                  </a:graphic>
+                </wp:inline>
+              </w:drawing>
+            </w:r>
+          </w:p>
+          <w:p>
+            <w:pPr>
+              <w:spacing w:after="120"/>
+              <w:jc w:val="center"/>
+              <w:rPr>
+                <w:lang w:val="pt-BR"/>
+              </w:rPr>
+            </w:pPr>
+            <w:r>
+              <w:rPr>
+                <w:i/>
+                <w:sz w:val="16"/>
+                <w:lang w:val="pt-BR"/>
+              </w:rPr>
+              <w:t xml:space="preserve">Meus times: carteirinha e elenco</w:t>
+            </w:r>
+          </w:p>
+        </w:tc>
+        <w:tc>
+          <w:tcPr>
+            <w:tcW w:w="3229" w:type="dxa"/>
+            <w:tcMar>
+              <w:top w:w="80" w:type="dxa"/>
+              <w:left w:w="80" w:type="dxa"/>
+              <w:bottom w:w="80" w:type="dxa"/>
+              <w:right w:w="80" w:type="dxa"/>
+            </w:tcMar>
+          </w:tcPr>
+          <w:p>
+            <w:pPr>
+              <w:keepNext/>
+              <w:spacing w:after="40"/>
+              <w:jc w:val="center"/>
+              <w:rPr>
+                <w:lang w:val="pt-BR"/>
+              </w:rPr>
+            </w:pPr>
+            <w:r>
+              <w:rPr>
+                <w:noProof/>
+              </w:rPr>
+              <w:drawing>
+                <wp:inline distT="0" distB="0" distL="0" distR="0">
+                  <wp:extent cx="1682750" cy="3641644"/>
+                  <wp:effectExtent l="0" t="0" r="0" b="0"/>
+                  <wp:docPr id="910008" name="08-campeonatos.png" descr="Campeonatos: inscrição em torneio"/>
+                  <wp:cNvGraphicFramePr>
+                    <a:graphicFrameLocks xmlns:a="http://schemas.openxmlformats.org/drawingml/2006/main" noChangeAspect="1"/>
+                  </wp:cNvGraphicFramePr>
+                  <a:graphic xmlns:a="http://schemas.openxmlformats.org/drawingml/2006/main">
+                    <a:graphicData uri="http://schemas.openxmlformats.org/drawingml/2006/picture">
+                      <pic:pic xmlns:pic="http://schemas.openxmlformats.org/drawingml/2006/picture">
+                        <pic:nvPicPr>
+                          <pic:cNvPr id="0" name="08-campeonatos.png"/>
+                          <pic:cNvPicPr/>
+                        </pic:nvPicPr>
+                        <pic:blipFill>
+                          <a:blip r:embed="rIdRot8"/>
+                          <a:stretch>
+                            <a:fillRect/>
+                          </a:stretch>
+                        </pic:blipFill>
+                        <pic:spPr>
+                          <a:xfrm>
+                            <a:off x="0" y="0"/>
+                            <a:ext cx="1682750" cy="3641644"/>
+                          </a:xfrm>
+                          <a:prstGeom prst="rect">
+                            <a:avLst/>
+                          </a:prstGeom>
+                        </pic:spPr>
+                      </pic:pic>
+                    </a:graphicData>
+                  </a:graphic>
+                </wp:inline>
+              </w:drawing>
+            </w:r>
+          </w:p>
+          <w:p>
+            <w:pPr>
+              <w:spacing w:after="120"/>
+              <w:jc w:val="center"/>
+              <w:rPr>
+                <w:lang w:val="pt-BR"/>
+              </w:rPr>
+            </w:pPr>
+            <w:r>
+              <w:rPr>
+                <w:i/>
+                <w:sz w:val="16"/>
+                <w:lang w:val="pt-BR"/>
+              </w:rPr>
+              <w:t xml:space="preserve">Campeonatos: inscrição em torneio</w:t>
+            </w:r>
+          </w:p>
+        </w:tc>
+        <w:tc>
+          <w:tcPr>
+            <w:tcW w:w="3229" w:type="dxa"/>
+            <w:tcMar>
+              <w:top w:w="80" w:type="dxa"/>
+              <w:left w:w="80" w:type="dxa"/>
+              <w:bottom w:w="80" w:type="dxa"/>
+              <w:right w:w="80" w:type="dxa"/>
+            </w:tcMar>
+          </w:tcPr>
+          <w:p>
+            <w:pPr>
+              <w:keepNext/>
+              <w:spacing w:after="40"/>
+              <w:jc w:val="center"/>
+              <w:rPr>
+                <w:lang w:val="pt-BR"/>
+              </w:rPr>
+            </w:pPr>
+            <w:r>
+              <w:rPr>
+                <w:noProof/>
+              </w:rPr>
+              <w:drawing>
+                <wp:inline distT="0" distB="0" distL="0" distR="0">
+                  <wp:extent cx="1682750" cy="3641644"/>
+                  <wp:effectExtent l="0" t="0" r="0" b="0"/>
+                  <wp:docPr id="910009" name="09-notificacoes.png" descr="Notificações"/>
+                  <wp:cNvGraphicFramePr>
+                    <a:graphicFrameLocks xmlns:a="http://schemas.openxmlformats.org/drawingml/2006/main" noChangeAspect="1"/>
+                  </wp:cNvGraphicFramePr>
+                  <a:graphic xmlns:a="http://schemas.openxmlformats.org/drawingml/2006/main">
+                    <a:graphicData uri="http://schemas.openxmlformats.org/drawingml/2006/picture">
+                      <pic:pic xmlns:pic="http://schemas.openxmlformats.org/drawingml/2006/picture">
+                        <pic:nvPicPr>
+                          <pic:cNvPr id="0" name="09-notificacoes.png"/>
+                          <pic:cNvPicPr/>
+                        </pic:nvPicPr>
+                        <pic:blipFill>
+                          <a:blip r:embed="rIdRot9"/>
+                          <a:stretch>
+                            <a:fillRect/>
+                          </a:stretch>
+                        </pic:blipFill>
+                        <pic:spPr>
+                          <a:xfrm>
+                            <a:off x="0" y="0"/>
+                            <a:ext cx="1682750" cy="3641644"/>
+                          </a:xfrm>
+                          <a:prstGeom prst="rect">
+                            <a:avLst/>
+                          </a:prstGeom>
+                        </pic:spPr>
+                      </pic:pic>
+                    </a:graphicData>
+                  </a:graphic>
+                </wp:inline>
+              </w:drawing>
+            </w:r>
+          </w:p>
+          <w:p>
+            <w:pPr>
+              <w:spacing w:after="120"/>
+              <w:jc w:val="center"/>
+              <w:rPr>
+                <w:lang w:val="pt-BR"/>
+              </w:rPr>
+            </w:pPr>
+            <w:r>
+              <w:rPr>
+                <w:i/>
+                <w:sz w:val="16"/>
+                <w:lang w:val="pt-BR"/>
+              </w:rPr>
+              <w:t xml:space="preserve">Notificações</w:t>
+            </w:r>
+          </w:p>
+        </w:tc>
+      </w:tr>
+      <w:tr>
+        <w:trPr>
+          <w:cantSplit/>
+          <w:jc w:val="center"/>
+        </w:trPr>
+        <w:tc>
+          <w:tcPr>
+            <w:tcW w:w="3229" w:type="dxa"/>
+            <w:tcMar>
+              <w:top w:w="80" w:type="dxa"/>
+              <w:left w:w="80" w:type="dxa"/>
+              <w:bottom w:w="80" w:type="dxa"/>
+              <w:right w:w="80" w:type="dxa"/>
+            </w:tcMar>
+          </w:tcPr>
+          <w:p>
+            <w:pPr>
+              <w:keepNext/>
+              <w:spacing w:after="40"/>
+              <w:jc w:val="center"/>
+              <w:rPr>
+                <w:lang w:val="pt-BR"/>
+              </w:rPr>
+            </w:pPr>
+            <w:r>
+              <w:rPr>
+                <w:noProof/>
+              </w:rPr>
+              <w:drawing>
+                <wp:inline distT="0" distB="0" distL="0" distR="0">
+                  <wp:extent cx="1682750" cy="3641644"/>
+                  <wp:effectExtent l="0" t="0" r="0" b="0"/>
+                  <wp:docPr id="910010" name="10-perfil.png" descr="Perfil do atleta"/>
+                  <wp:cNvGraphicFramePr>
+                    <a:graphicFrameLocks xmlns:a="http://schemas.openxmlformats.org/drawingml/2006/main" noChangeAspect="1"/>
+                  </wp:cNvGraphicFramePr>
+                  <a:graphic xmlns:a="http://schemas.openxmlformats.org/drawingml/2006/main">
+                    <a:graphicData uri="http://schemas.openxmlformats.org/drawingml/2006/picture">
+                      <pic:pic xmlns:pic="http://schemas.openxmlformats.org/drawingml/2006/picture">
+                        <pic:nvPicPr>
+                          <pic:cNvPr id="0" name="10-perfil.png"/>
+                          <pic:cNvPicPr/>
+                        </pic:nvPicPr>
+                        <pic:blipFill>
+                          <a:blip r:embed="rIdRot10"/>
+                          <a:stretch>
+                            <a:fillRect/>
+                          </a:stretch>
+                        </pic:blipFill>
+                        <pic:spPr>
+                          <a:xfrm>
+                            <a:off x="0" y="0"/>
+                            <a:ext cx="1682750" cy="3641644"/>
+                          </a:xfrm>
+                          <a:prstGeom prst="rect">
+                            <a:avLst/>
+                          </a:prstGeom>
+                        </pic:spPr>
+                      </pic:pic>
+                    </a:graphicData>
+                  </a:graphic>
+                </wp:inline>
+              </w:drawing>
+            </w:r>
+          </w:p>
+          <w:p>
+            <w:pPr>
+              <w:spacing w:after="120"/>
+              <w:jc w:val="center"/>
+              <w:rPr>
+                <w:lang w:val="pt-BR"/>
+              </w:rPr>
+            </w:pPr>
+            <w:r>
+              <w:rPr>
+                <w:i/>
+                <w:sz w:val="16"/>
+                <w:lang w:val="pt-BR"/>
+              </w:rPr>
+              <w:t xml:space="preserve">Perfil do atleta</w:t>
+            </w:r>
+          </w:p>
+        </w:tc>
+        <w:tc>
+          <w:tcPr>
+            <w:tcW w:w="3229" w:type="dxa"/>
+            <w:tcMar>
+              <w:top w:w="80" w:type="dxa"/>
+              <w:left w:w="80" w:type="dxa"/>
+              <w:bottom w:w="80" w:type="dxa"/>
+              <w:right w:w="80" w:type="dxa"/>
+            </w:tcMar>
+          </w:tcPr>
+          <w:p>
+            <w:pPr>
+              <w:keepNext/>
+              <w:spacing w:after="40"/>
+              <w:jc w:val="center"/>
+              <w:rPr>
+                <w:lang w:val="pt-BR"/>
+              </w:rPr>
+            </w:pPr>
+            <w:r>
+              <w:rPr>
+                <w:noProof/>
+              </w:rPr>
+              <w:drawing>
+                <wp:inline distT="0" distB="0" distL="0" distR="0">
+                  <wp:extent cx="1682750" cy="3641644"/>
+                  <wp:effectExtent l="0" t="0" r="0" b="0"/>
+                  <wp:docPr id="910011" name="11-comunidade.png" descr="Perfil de outra atleta (seguir)"/>
+                  <wp:cNvGraphicFramePr>
+                    <a:graphicFrameLocks xmlns:a="http://schemas.openxmlformats.org/drawingml/2006/main" noChangeAspect="1"/>
+                  </wp:cNvGraphicFramePr>
+                  <a:graphic xmlns:a="http://schemas.openxmlformats.org/drawingml/2006/main">
+                    <a:graphicData uri="http://schemas.openxmlformats.org/drawingml/2006/picture">
+                      <pic:pic xmlns:pic="http://schemas.openxmlformats.org/drawingml/2006/picture">
+                        <pic:nvPicPr>
+                          <pic:cNvPr id="0" name="11-comunidade.png"/>
+                          <pic:cNvPicPr/>
+                        </pic:nvPicPr>
+                        <pic:blipFill>
+                          <a:blip r:embed="rIdRot11"/>
+                          <a:stretch>
+                            <a:fillRect/>
+                          </a:stretch>
+                        </pic:blipFill>
+                        <pic:spPr>
+                          <a:xfrm>
+                            <a:off x="0" y="0"/>
+                            <a:ext cx="1682750" cy="3641644"/>
+                          </a:xfrm>
+                          <a:prstGeom prst="rect">
+                            <a:avLst/>
+                          </a:prstGeom>
+                        </pic:spPr>
+                      </pic:pic>
+                    </a:graphicData>
+                  </a:graphic>
+                </wp:inline>
+              </w:drawing>
+            </w:r>
+          </w:p>
+          <w:p>
+            <w:pPr>
+              <w:spacing w:after="120"/>
+              <w:jc w:val="center"/>
+              <w:rPr>
+                <w:lang w:val="pt-BR"/>
+              </w:rPr>
+            </w:pPr>
+            <w:r>
+              <w:rPr>
+                <w:i/>
+                <w:sz w:val="16"/>
+                <w:lang w:val="pt-BR"/>
+              </w:rPr>
+              <w:t xml:space="preserve">Perfil de outra atleta (seguir)</w:t>
+            </w:r>
+          </w:p>
+        </w:tc>
+        <w:tc>
+          <w:tcPr>
+            <w:tcW w:w="3229" w:type="dxa"/>
+            <w:tcMar>
+              <w:top w:w="80" w:type="dxa"/>
+              <w:left w:w="80" w:type="dxa"/>
+              <w:bottom w:w="80" w:type="dxa"/>
+              <w:right w:w="80" w:type="dxa"/>
+            </w:tcMar>
+          </w:tcPr>
+          <w:p>
+            <w:pPr>
+              <w:keepNext/>
+              <w:spacing w:after="40"/>
+              <w:jc w:val="center"/>
+              <w:rPr>
+                <w:lang w:val="pt-BR"/>
+              </w:rPr>
+            </w:pPr>
+            <w:r>
+              <w:rPr>
+                <w:noProof/>
+              </w:rPr>
+              <w:drawing>
+                <wp:inline distT="0" distB="0" distL="0" distR="0">
+                  <wp:extent cx="1682750" cy="3641644"/>
+                  <wp:effectExtent l="0" t="0" r="0" b="0"/>
+                  <wp:docPr id="910012" name="12-inicio-escuro.png" descr="Início no tema escuro"/>
+                  <wp:cNvGraphicFramePr>
+                    <a:graphicFrameLocks xmlns:a="http://schemas.openxmlformats.org/drawingml/2006/main" noChangeAspect="1"/>
+                  </wp:cNvGraphicFramePr>
+                  <a:graphic xmlns:a="http://schemas.openxmlformats.org/drawingml/2006/main">
+                    <a:graphicData uri="http://schemas.openxmlformats.org/drawingml/2006/picture">
+                      <pic:pic xmlns:pic="http://schemas.openxmlformats.org/drawingml/2006/picture">
+                        <pic:nvPicPr>
+                          <pic:cNvPr id="0" name="12-inicio-escuro.png"/>
+                          <pic:cNvPicPr/>
+                        </pic:nvPicPr>
+                        <pic:blipFill>
+                          <a:blip r:embed="rIdRot12"/>
+                          <a:stretch>
+                            <a:fillRect/>
+                          </a:stretch>
+                        </pic:blipFill>
+                        <pic:spPr>
+                          <a:xfrm>
+                            <a:off x="0" y="0"/>
+                            <a:ext cx="1682750" cy="3641644"/>
+                          </a:xfrm>
+                          <a:prstGeom prst="rect">
+                            <a:avLst/>
+                          </a:prstGeom>
+                        </pic:spPr>
+                      </pic:pic>
+                    </a:graphicData>
+                  </a:graphic>
+                </wp:inline>
+              </w:drawing>
+            </w:r>
+          </w:p>
+          <w:p>
+            <w:pPr>
+              <w:spacing w:after="120"/>
+              <w:jc w:val="center"/>
+              <w:rPr>
+                <w:lang w:val="pt-BR"/>
+              </w:rPr>
+            </w:pPr>
+            <w:r>
+              <w:rPr>
+                <w:i/>
+                <w:sz w:val="16"/>
+                <w:lang w:val="pt-BR"/>
+              </w:rPr>
+              <w:t xml:space="preserve">Início no tema escuro</w:t>
             </w:r>
           </w:p>
         </w:tc>
@@ -13298,13 +14785,17 @@
             <w:pPr>
               <w:spacing w:after="40"/>
               <w:jc w:val="center"/>
+              <w:rPr>
+                <w:lang w:val="pt-BR"/>
+              </w:rPr>
             </w:pPr>
             <w:r>
               <w:rPr>
                 <w:b/>
                 <w:sz w:val="16"/>
-              </w:rPr>
-              <w:t>Item</w:t>
+                <w:lang w:val="pt-BR"/>
+              </w:rPr>
+              <w:t xml:space="preserve">Item</w:t>
             </w:r>
           </w:p>
         </w:tc>
@@ -13324,13 +14815,17 @@
             <w:pPr>
               <w:spacing w:after="40"/>
               <w:jc w:val="center"/>
+              <w:rPr>
+                <w:lang w:val="pt-BR"/>
+              </w:rPr>
             </w:pPr>
             <w:r>
               <w:rPr>
                 <w:b/>
                 <w:sz w:val="16"/>
-              </w:rPr>
-              <w:t>Informação</w:t>
+                <w:lang w:val="pt-BR"/>
+              </w:rPr>
+              <w:t xml:space="preserve">Informação</w:t>
             </w:r>
           </w:p>
         </w:tc>
@@ -13354,12 +14849,15 @@
           <w:p>
             <w:pPr>
               <w:spacing w:after="40"/>
-            </w:pPr>
-            <w:r>
-              <w:rPr>
-                <w:sz w:val="16"/>
-              </w:rPr>
-              <w:lastRenderedPageBreak/>
+              <w:rPr>
+                <w:lang w:val="pt-BR"/>
+              </w:rPr>
+            </w:pPr>
+            <w:r>
+              <w:rPr>
+                <w:sz w:val="16"/>
+                <w:lang w:val="pt-BR"/>
+              </w:rPr>
               <w:t xml:space="preserve">SGBD utilizado</w:t>
             </w:r>
           </w:p>
@@ -13378,12 +14876,31 @@
           <w:p>
             <w:pPr>
               <w:spacing w:after="40"/>
-            </w:pPr>
-            <w:r>
-              <w:rPr>
-                <w:sz w:val="16"/>
-              </w:rPr>
-              <w:t>PostgreSQL 16.</w:t>
+              <w:rPr>
+                <w:lang w:val="pt-BR"/>
+              </w:rPr>
+            </w:pPr>
+            <w:r>
+              <w:rPr>
+                <w:sz w:val="16"/>
+                <w:lang w:val="pt-BR"/>
+              </w:rPr>
+              <w:t xml:space="preserve">PostgreSQL 16 (16.15, imagem </w:t>
+            </w:r>
+            <w:r>
+              <w:rPr>
+                <w:rFonts w:ascii="Consolas" w:hAnsi="Consolas"/>
+                <w:sz w:val="16"/>
+                <w:lang w:val="pt-BR"/>
+              </w:rPr>
+              <w:t xml:space="preserve">postgres:16</w:t>
+            </w:r>
+            <w:r>
+              <w:rPr>
+                <w:sz w:val="16"/>
+                <w:lang w:val="pt-BR"/>
+              </w:rPr>
+              <w:t xml:space="preserve"> do Docker Compose).</w:t>
             </w:r>
           </w:p>
         </w:tc>
@@ -13407,10 +14924,14 @@
           <w:p>
             <w:pPr>
               <w:spacing w:after="40"/>
-            </w:pPr>
-            <w:r>
-              <w:rPr>
-                <w:sz w:val="16"/>
+              <w:rPr>
+                <w:lang w:val="pt-BR"/>
+              </w:rPr>
+            </w:pPr>
+            <w:r>
+              <w:rPr>
+                <w:sz w:val="16"/>
+                <w:lang w:val="pt-BR"/>
               </w:rPr>
               <w:t xml:space="preserve">Situação da implementação</w:t>
             </w:r>
@@ -13430,12 +14951,16 @@
           <w:p>
             <w:pPr>
               <w:spacing w:after="40"/>
-            </w:pPr>
-            <w:r>
-              <w:rPr>
-                <w:sz w:val="16"/>
-              </w:rPr>
-              <w:t>Esquema da fundação implementado: municípios, usuários, sessões e perfis esportivos.</w:t>
+              <w:rPr>
+                <w:lang w:val="pt-BR"/>
+              </w:rPr>
+            </w:pPr>
+            <w:r>
+              <w:rPr>
+                <w:sz w:val="16"/>
+                <w:lang w:val="pt-BR"/>
+              </w:rPr>
+              <w:t xml:space="preserve">Esquema implementado e usado pelos fluxos integrados: 40 tabelas, 486 colunas, 126 chaves estrangeiras, 17 restrições UNIQUE, 167 restrições CHECK e 164 índices (contagem no catálogo em 23/10/2026, na revisão Alembic 0014).</w:t>
             </w:r>
           </w:p>
         </w:tc>
@@ -13468,7 +14993,7 @@
                 <w:sz w:val="16"/>
                 <w:lang w:val="pt-BR"/>
               </w:rPr>
-              <w:t>Local dos scripts no repositório</w:t>
+              <w:t xml:space="preserve">Mapeamento e migrações</w:t>
             </w:r>
           </w:p>
         </w:tc>
@@ -13495,7 +15020,340 @@
                 <w:sz w:val="16"/>
                 <w:lang w:val="pt-BR"/>
               </w:rPr>
-              <w:t>backend/migrations/; testes de integração executam em schema aleatório isolado.</w:t>
+              <w:t xml:space="preserve">Modelos SQLAlchemy 2.1 e migrações Alembic versionadas, de 0001 a 0014 (os números 0006 e 0007 não foram usados). A API não cria tabelas na inicialização; o esquema só muda por migração. </w:t>
+            </w:r>
+            <w:r>
+              <w:rPr>
+                <w:rFonts w:ascii="Consolas" w:hAnsi="Consolas"/>
+                <w:sz w:val="16"/>
+                <w:lang w:val="pt-BR"/>
+              </w:rPr>
+              <w:t xml:space="preserve">alembic check</w:t>
+            </w:r>
+            <w:r>
+              <w:rPr>
+                <w:sz w:val="16"/>
+                <w:lang w:val="pt-BR"/>
+              </w:rPr>
+              <w:t xml:space="preserve"> sem diferenças entre modelos e banco em 23/10/2026.</w:t>
+            </w:r>
+          </w:p>
+        </w:tc>
+      </w:tr>
+      <w:tr>
+        <w:trPr>
+          <w:cantSplit/>
+          <w:jc w:val="center"/>
+        </w:trPr>
+        <w:tc>
+          <w:tcPr>
+            <w:tcW w:w="3402" w:type="dxa"/>
+            <w:tcMar>
+              <w:top w:w="80" w:type="dxa"/>
+              <w:left w:w="80" w:type="dxa"/>
+              <w:bottom w:w="80" w:type="dxa"/>
+              <w:right w:w="80" w:type="dxa"/>
+            </w:tcMar>
+            <w:vAlign w:val="center"/>
+          </w:tcPr>
+          <w:p>
+            <w:pPr>
+              <w:spacing w:after="40"/>
+              <w:rPr>
+                <w:lang w:val="pt-BR"/>
+              </w:rPr>
+            </w:pPr>
+            <w:r>
+              <w:rPr>
+                <w:sz w:val="16"/>
+                <w:lang w:val="pt-BR"/>
+              </w:rPr>
+              <w:t xml:space="preserve">Local dos scripts no repositório</w:t>
+            </w:r>
+          </w:p>
+        </w:tc>
+        <w:tc>
+          <w:tcPr>
+            <w:tcW w:w="5670" w:type="dxa"/>
+            <w:tcMar>
+              <w:top w:w="80" w:type="dxa"/>
+              <w:left w:w="80" w:type="dxa"/>
+              <w:bottom w:w="80" w:type="dxa"/>
+              <w:right w:w="80" w:type="dxa"/>
+            </w:tcMar>
+            <w:vAlign w:val="center"/>
+          </w:tcPr>
+          <w:p>
+            <w:pPr>
+              <w:spacing w:after="40"/>
+              <w:rPr>
+                <w:lang w:val="pt-BR"/>
+              </w:rPr>
+            </w:pPr>
+            <w:r>
+              <w:rPr>
+                <w:rFonts w:ascii="Consolas" w:hAnsi="Consolas"/>
+                <w:sz w:val="16"/>
+                <w:lang w:val="pt-BR"/>
+              </w:rPr>
+              <w:t xml:space="preserve">backend/migrations/versions/</w:t>
+            </w:r>
+            <w:r>
+              <w:rPr>
+                <w:sz w:val="16"/>
+                <w:lang w:val="pt-BR"/>
+              </w:rPr>
+              <w:t xml:space="preserve"> (migrações), </w:t>
+            </w:r>
+            <w:r>
+              <w:rPr>
+                <w:rFonts w:ascii="Consolas" w:hAnsi="Consolas"/>
+                <w:sz w:val="16"/>
+                <w:lang w:val="pt-BR"/>
+              </w:rPr>
+              <w:t xml:space="preserve">backend/app/models/</w:t>
+            </w:r>
+            <w:r>
+              <w:rPr>
+                <w:sz w:val="16"/>
+                <w:lang w:val="pt-BR"/>
+              </w:rPr>
+              <w:t xml:space="preserve"> (modelos) e </w:t>
+            </w:r>
+            <w:r>
+              <w:rPr>
+                <w:rFonts w:ascii="Consolas" w:hAnsi="Consolas"/>
+                <w:sz w:val="16"/>
+                <w:lang w:val="pt-BR"/>
+              </w:rPr>
+              <w:t xml:space="preserve">backend/app/seed.py</w:t>
+            </w:r>
+            <w:r>
+              <w:rPr>
+                <w:sz w:val="16"/>
+                <w:lang w:val="pt-BR"/>
+              </w:rPr>
+              <w:t xml:space="preserve"> (seed opcional de desenvolvimento).</w:t>
+            </w:r>
+          </w:p>
+        </w:tc>
+      </w:tr>
+      <w:tr>
+        <w:trPr>
+          <w:cantSplit/>
+          <w:jc w:val="center"/>
+        </w:trPr>
+        <w:tc>
+          <w:tcPr>
+            <w:tcW w:w="3402" w:type="dxa"/>
+            <w:tcMar>
+              <w:top w:w="80" w:type="dxa"/>
+              <w:left w:w="80" w:type="dxa"/>
+              <w:bottom w:w="80" w:type="dxa"/>
+              <w:right w:w="80" w:type="dxa"/>
+            </w:tcMar>
+            <w:vAlign w:val="center"/>
+          </w:tcPr>
+          <w:p>
+            <w:pPr>
+              <w:spacing w:after="40"/>
+              <w:rPr>
+                <w:lang w:val="pt-BR"/>
+              </w:rPr>
+            </w:pPr>
+            <w:r>
+              <w:rPr>
+                <w:sz w:val="16"/>
+                <w:lang w:val="pt-BR"/>
+              </w:rPr>
+              <w:t xml:space="preserve">Organização por domínio</w:t>
+            </w:r>
+          </w:p>
+        </w:tc>
+        <w:tc>
+          <w:tcPr>
+            <w:tcW w:w="5670" w:type="dxa"/>
+            <w:tcMar>
+              <w:top w:w="80" w:type="dxa"/>
+              <w:left w:w="80" w:type="dxa"/>
+              <w:bottom w:w="80" w:type="dxa"/>
+              <w:right w:w="80" w:type="dxa"/>
+            </w:tcMar>
+            <w:vAlign w:val="center"/>
+          </w:tcPr>
+          <w:p>
+            <w:pPr>
+              <w:spacing w:after="40"/>
+              <w:rPr>
+                <w:lang w:val="pt-BR"/>
+              </w:rPr>
+            </w:pPr>
+            <w:r>
+              <w:rPr>
+                <w:b/>
+                <w:sz w:val="16"/>
+                <w:lang w:val="pt-BR"/>
+              </w:rPr>
+              <w:t xml:space="preserve">Identidade e conta:</w:t>
+            </w:r>
+            <w:r>
+              <w:rPr>
+                <w:sz w:val="16"/>
+                <w:lang w:val="pt-BR"/>
+              </w:rPr>
+              <w:t xml:space="preserve"> users, cities, auth_sessions, sports_profiles, media_objects, notifications, audit_log.</w:t>
+            </w:r>
+          </w:p>
+          <w:p>
+            <w:pPr>
+              <w:spacing w:after="40"/>
+              <w:rPr>
+                <w:lang w:val="pt-BR"/>
+              </w:rPr>
+            </w:pPr>
+            <w:r>
+              <w:rPr>
+                <w:b/>
+                <w:sz w:val="16"/>
+                <w:lang w:val="pt-BR"/>
+              </w:rPr>
+              <w:t xml:space="preserve">Comunidade e moderação:</w:t>
+            </w:r>
+            <w:r>
+              <w:rPr>
+                <w:sz w:val="16"/>
+                <w:lang w:val="pt-BR"/>
+              </w:rPr>
+              <w:t xml:space="preserve"> posts, post_comments, post_likes, follows, user_blocks, content_reports, moderation_actions.</w:t>
+            </w:r>
+          </w:p>
+          <w:p>
+            <w:pPr>
+              <w:spacing w:after="40"/>
+              <w:rPr>
+                <w:lang w:val="pt-BR"/>
+              </w:rPr>
+            </w:pPr>
+            <w:r>
+              <w:rPr>
+                <w:b/>
+                <w:sz w:val="16"/>
+                <w:lang w:val="pt-BR"/>
+              </w:rPr>
+              <w:t xml:space="preserve">Times, organizadores e ranking:</w:t>
+            </w:r>
+            <w:r>
+              <w:rPr>
+                <w:sz w:val="16"/>
+                <w:lang w:val="pt-BR"/>
+              </w:rPr>
+              <w:t xml:space="preserve"> teams, team_members, team_invites, team_join_requests, organizer_requests, organizers, standings, rank_cuts.</w:t>
+            </w:r>
+          </w:p>
+          <w:p>
+            <w:pPr>
+              <w:spacing w:after="40"/>
+              <w:rPr>
+                <w:lang w:val="pt-BR"/>
+              </w:rPr>
+            </w:pPr>
+            <w:r>
+              <w:rPr>
+                <w:b/>
+                <w:sz w:val="16"/>
+                <w:lang w:val="pt-BR"/>
+              </w:rPr>
+              <w:t xml:space="preserve">Partidas e quadras:</w:t>
+            </w:r>
+            <w:r>
+              <w:rPr>
+                <w:sz w:val="16"/>
+                <w:lang w:val="pt-BR"/>
+              </w:rPr>
+              <w:t xml:space="preserve"> matches, match_searches, match_sides, match_slots, match_lineups, match_terms, match_messages, match_results, football_stats, courts.</w:t>
+            </w:r>
+          </w:p>
+          <w:p>
+            <w:pPr>
+              <w:spacing w:after="40"/>
+              <w:rPr>
+                <w:lang w:val="pt-BR"/>
+              </w:rPr>
+            </w:pPr>
+            <w:r>
+              <w:rPr>
+                <w:b/>
+                <w:sz w:val="16"/>
+                <w:lang w:val="pt-BR"/>
+              </w:rPr>
+              <w:t xml:space="preserve">Campeonatos, inscrições e corrida:</w:t>
+            </w:r>
+            <w:r>
+              <w:rPr>
+                <w:sz w:val="16"/>
+                <w:lang w:val="pt-BR"/>
+              </w:rPr>
+              <w:t xml:space="preserve"> events, event_entries, entry_receipts, event_brackets, event_messages, event_placements, result_decisions, runs.</w:t>
+            </w:r>
+          </w:p>
+        </w:tc>
+      </w:tr>
+      <w:tr>
+        <w:trPr>
+          <w:cantSplit/>
+          <w:jc w:val="center"/>
+        </w:trPr>
+        <w:tc>
+          <w:tcPr>
+            <w:tcW w:w="3402" w:type="dxa"/>
+            <w:tcMar>
+              <w:top w:w="80" w:type="dxa"/>
+              <w:left w:w="80" w:type="dxa"/>
+              <w:bottom w:w="80" w:type="dxa"/>
+              <w:right w:w="80" w:type="dxa"/>
+            </w:tcMar>
+            <w:vAlign w:val="center"/>
+          </w:tcPr>
+          <w:p>
+            <w:pPr>
+              <w:spacing w:after="40"/>
+              <w:rPr>
+                <w:lang w:val="pt-BR"/>
+              </w:rPr>
+            </w:pPr>
+            <w:r>
+              <w:rPr>
+                <w:sz w:val="16"/>
+                <w:lang w:val="pt-BR"/>
+              </w:rPr>
+              <w:t xml:space="preserve">Testes com banco</w:t>
+            </w:r>
+          </w:p>
+        </w:tc>
+        <w:tc>
+          <w:tcPr>
+            <w:tcW w:w="5670" w:type="dxa"/>
+            <w:tcMar>
+              <w:top w:w="80" w:type="dxa"/>
+              <w:left w:w="80" w:type="dxa"/>
+              <w:bottom w:w="80" w:type="dxa"/>
+              <w:right w:w="80" w:type="dxa"/>
+            </w:tcMar>
+            <w:vAlign w:val="center"/>
+          </w:tcPr>
+          <w:p>
+            <w:pPr>
+              <w:spacing w:after="40"/>
+              <w:rPr>
+                <w:lang w:val="pt-BR"/>
+              </w:rPr>
+            </w:pPr>
+            <w:r>
+              <w:rPr>
+                <w:sz w:val="16"/>
+                <w:lang w:val="pt-BR"/>
+              </w:rPr>
+              <w:t xml:space="preserve">Os testes de integração do backend aplicam as migrações num schema PostgreSQL aleatório e isolado, removido ao final.</w:t>
             </w:r>
           </w:p>
         </w:tc>
@@ -13511,6 +15369,8 @@
     </w:p>
     <w:p>
       <w:pPr>
+        <w:keepNext/>
+        <w:spacing w:after="60"/>
         <w:rPr>
           <w:lang w:val="pt-BR"/>
         </w:rPr>
@@ -13520,12 +15380,12 @@
           <w:b/>
           <w:lang w:val="pt-BR"/>
         </w:rPr>
-        <w:t>Dados iniciais</w:t>
+        <w:t xml:space="preserve">Dados iniciais</w:t>
       </w:r>
     </w:p>
     <w:p>
       <w:pPr>
-        <w:spacing w:after="80"/>
+        <w:spacing w:after="160"/>
         <w:rPr>
           <w:lang w:val="pt-BR"/>
         </w:rPr>
@@ -13534,16 +15394,480 @@
         <w:rPr>
           <w:lang w:val="pt-BR"/>
         </w:rPr>
-        <w:t>Dados da interface: conta e perfis consumidos da API; áreas futuras usam estados vazios. Não implementar moedas/carteira ou adicionar dados demonstrativos à interface sem nova solicitação. O seed opcional de desenvolvimento cria somente uma conta e perfis; não representa partidas, rankings ou eventos implementados.</w:t>
+        <w:t xml:space="preserve">As migrações carregam os dados de referência: a 0001 insere o catálogo inicial de 6 municípios (Brasília, São Paulo, Rio de Janeiro, Fortaleza, Belo Horizonte e Goiânia, com código IBGE) e a 0005 insere os 8 cortes de pontuação dos elos (</w:t>
+      </w:r>
+      <w:r>
+        <w:rPr>
+          <w:rFonts w:ascii="Consolas" w:hAnsi="Consolas"/>
+          <w:lang w:val="pt-BR"/>
+        </w:rPr>
+        <w:t xml:space="preserve">rank_cuts</w:t>
+      </w:r>
+      <w:r>
+        <w:rPr>
+          <w:lang w:val="pt-BR"/>
+        </w:rPr>
+        <w:t xml:space="preserve">, versão de cálculo 1). O seed opcional (</w:t>
+      </w:r>
+      <w:r>
+        <w:rPr>
+          <w:rFonts w:ascii="Consolas" w:hAnsi="Consolas"/>
+          <w:lang w:val="pt-BR"/>
+        </w:rPr>
+        <w:t xml:space="preserve">python -m app.seed</w:t>
+      </w:r>
+      <w:r>
+        <w:rPr>
+          <w:lang w:val="pt-BR"/>
+        </w:rPr>
+        <w:t xml:space="preserve">, só em desenvolvimento) cria uma conta de demonstração com três perfis privados. Os demais registros são criados pelo uso da aplicação.</w:t>
       </w:r>
     </w:p>
     <w:p>
       <w:pPr>
-        <w:spacing w:after="40"/>
+        <w:keepNext/>
+        <w:spacing w:after="60"/>
         <w:rPr>
           <w:lang w:val="pt-BR"/>
         </w:rPr>
       </w:pPr>
+      <w:r>
+        <w:rPr>
+          <w:b/>
+          <w:lang w:val="pt-BR"/>
+        </w:rPr>
+        <w:t xml:space="preserve">Diagrama do banco de dados implementado</w:t>
+      </w:r>
+    </w:p>
+    <w:p>
+      <w:pPr>
+        <w:spacing w:after="160"/>
+        <w:rPr>
+          <w:lang w:val="pt-BR"/>
+        </w:rPr>
+      </w:pPr>
+      <w:r>
+        <w:rPr>
+          <w:lang w:val="pt-BR"/>
+        </w:rPr>
+        <w:t xml:space="preserve">Gerado por engenharia reversa do catálogo do PostgreSQL (</w:t>
+      </w:r>
+      <w:r>
+        <w:rPr>
+          <w:rFonts w:ascii="Consolas" w:hAnsi="Consolas"/>
+          <w:lang w:val="pt-BR"/>
+        </w:rPr>
+        <w:t xml:space="preserve">pg_catalog</w:t>
+      </w:r>
+      <w:r>
+        <w:rPr>
+          <w:lang w:val="pt-BR"/>
+        </w:rPr>
+        <w:t xml:space="preserve">) no banco de desenvolvimento, na revisão 0014, no estilo do diagrama do MySQL Workbench. PK indica chave primária, FK chave estrangeira e "?" coluna que aceita nulo. Nas linhas, o pé de galinha representa "muitos", o traço representa "um" e o círculo indica participação opcional. A visão geral mostra as 40 tabelas agrupadas por domínio; os diagramas seguintes detalham colunas e tipos, e referências a tabelas de outros domínios aparecem como "→ tabela". O modelo da seção 2.4 continua como registro do projeto; estes diagramas representam o esquema implementado. Arquivos em </w:t>
+      </w:r>
+      <w:r>
+        <w:rPr>
+          <w:rFonts w:ascii="Consolas" w:hAnsi="Consolas"/>
+          <w:lang w:val="pt-BR"/>
+        </w:rPr>
+        <w:t xml:space="preserve">docs/diagramas/banco-*.png</w:t>
+      </w:r>
+      <w:r>
+        <w:rPr>
+          <w:lang w:val="pt-BR"/>
+        </w:rPr>
+        <w:t xml:space="preserve">.</w:t>
+      </w:r>
+    </w:p>
+    <w:p>
+      <w:pPr>
+        <w:keepNext/>
+        <w:spacing w:after="60"/>
+        <w:rPr>
+          <w:lang w:val="pt-BR"/>
+        </w:rPr>
+      </w:pPr>
+      <w:r>
+        <w:rPr>
+          <w:b/>
+          <w:lang w:val="pt-BR"/>
+        </w:rPr>
+        <w:t xml:space="preserve">Visão geral do esquema (40 tabelas)</w:t>
+      </w:r>
+    </w:p>
+    <w:p>
+      <w:pPr>
+        <w:spacing w:after="200"/>
+        <w:jc w:val="center"/>
+        <w:rPr>
+          <w:lang w:val="pt-BR"/>
+        </w:rPr>
+      </w:pPr>
+      <w:r>
+        <w:rPr>
+          <w:noProof/>
+        </w:rPr>
+        <w:drawing>
+          <wp:inline distT="0" distB="0" distL="0" distR="0">
+            <wp:extent cx="3966072" cy="7900000"/>
+            <wp:effectExtent l="0" t="0" r="0" b="0"/>
+            <wp:docPr id="910013" name="banco-visao-geral.png" descr="Diagrama do banco: Visão geral do esquema (40 tabelas)"/>
+            <wp:cNvGraphicFramePr>
+              <a:graphicFrameLocks xmlns:a="http://schemas.openxmlformats.org/drawingml/2006/main" noChangeAspect="1"/>
+            </wp:cNvGraphicFramePr>
+            <a:graphic xmlns:a="http://schemas.openxmlformats.org/drawingml/2006/main">
+              <a:graphicData uri="http://schemas.openxmlformats.org/drawingml/2006/picture">
+                <pic:pic xmlns:pic="http://schemas.openxmlformats.org/drawingml/2006/picture">
+                  <pic:nvPicPr>
+                    <pic:cNvPr id="0" name="banco-visao-geral.png"/>
+                    <pic:cNvPicPr/>
+                  </pic:nvPicPr>
+                  <pic:blipFill>
+                    <a:blip r:embed="rIdRot13"/>
+                    <a:stretch>
+                      <a:fillRect/>
+                    </a:stretch>
+                  </pic:blipFill>
+                  <pic:spPr>
+                    <a:xfrm>
+                      <a:off x="0" y="0"/>
+                      <a:ext cx="3966072" cy="7900000"/>
+                    </a:xfrm>
+                    <a:prstGeom prst="rect">
+                      <a:avLst/>
+                    </a:prstGeom>
+                  </pic:spPr>
+                </pic:pic>
+              </a:graphicData>
+            </a:graphic>
+          </wp:inline>
+        </w:drawing>
+      </w:r>
+    </w:p>
+    <w:p>
+      <w:pPr>
+        <w:keepNext/>
+        <w:spacing w:after="60"/>
+        <w:rPr>
+          <w:lang w:val="pt-BR"/>
+        </w:rPr>
+      </w:pPr>
+      <w:r>
+        <w:rPr>
+          <w:b/>
+          <w:lang w:val="pt-BR"/>
+        </w:rPr>
+        <w:t xml:space="preserve">Identidade, conta e notificações</w:t>
+      </w:r>
+    </w:p>
+    <w:p>
+      <w:pPr>
+        <w:spacing w:after="200"/>
+        <w:jc w:val="center"/>
+        <w:rPr>
+          <w:lang w:val="pt-BR"/>
+        </w:rPr>
+      </w:pPr>
+      <w:r>
+        <w:rPr>
+          <w:noProof/>
+        </w:rPr>
+        <w:drawing>
+          <wp:inline distT="0" distB="0" distL="0" distR="0">
+            <wp:extent cx="6152515" cy="6745750"/>
+            <wp:effectExtent l="0" t="0" r="0" b="0"/>
+            <wp:docPr id="910014" name="banco-identidade.png" descr="Diagrama do banco: Identidade, conta e notificações"/>
+            <wp:cNvGraphicFramePr>
+              <a:graphicFrameLocks xmlns:a="http://schemas.openxmlformats.org/drawingml/2006/main" noChangeAspect="1"/>
+            </wp:cNvGraphicFramePr>
+            <a:graphic xmlns:a="http://schemas.openxmlformats.org/drawingml/2006/main">
+              <a:graphicData uri="http://schemas.openxmlformats.org/drawingml/2006/picture">
+                <pic:pic xmlns:pic="http://schemas.openxmlformats.org/drawingml/2006/picture">
+                  <pic:nvPicPr>
+                    <pic:cNvPr id="0" name="banco-identidade.png"/>
+                    <pic:cNvPicPr/>
+                  </pic:nvPicPr>
+                  <pic:blipFill>
+                    <a:blip r:embed="rIdRot14"/>
+                    <a:stretch>
+                      <a:fillRect/>
+                    </a:stretch>
+                  </pic:blipFill>
+                  <pic:spPr>
+                    <a:xfrm>
+                      <a:off x="0" y="0"/>
+                      <a:ext cx="6152515" cy="6745750"/>
+                    </a:xfrm>
+                    <a:prstGeom prst="rect">
+                      <a:avLst/>
+                    </a:prstGeom>
+                  </pic:spPr>
+                </pic:pic>
+              </a:graphicData>
+            </a:graphic>
+          </wp:inline>
+        </w:drawing>
+      </w:r>
+    </w:p>
+    <w:p>
+      <w:pPr>
+        <w:keepNext/>
+        <w:spacing w:after="60"/>
+        <w:rPr>
+          <w:lang w:val="pt-BR"/>
+        </w:rPr>
+      </w:pPr>
+      <w:r>
+        <w:rPr>
+          <w:b/>
+          <w:lang w:val="pt-BR"/>
+        </w:rPr>
+        <w:t xml:space="preserve">Comunidade e moderação</w:t>
+      </w:r>
+    </w:p>
+    <w:p>
+      <w:pPr>
+        <w:spacing w:after="200"/>
+        <w:jc w:val="center"/>
+        <w:rPr>
+          <w:lang w:val="pt-BR"/>
+        </w:rPr>
+      </w:pPr>
+      <w:r>
+        <w:rPr>
+          <w:noProof/>
+        </w:rPr>
+        <w:drawing>
+          <wp:inline distT="0" distB="0" distL="0" distR="0">
+            <wp:extent cx="6152515" cy="6446074"/>
+            <wp:effectExtent l="0" t="0" r="0" b="0"/>
+            <wp:docPr id="910015" name="banco-comunidade.png" descr="Diagrama do banco: Comunidade e moderação"/>
+            <wp:cNvGraphicFramePr>
+              <a:graphicFrameLocks xmlns:a="http://schemas.openxmlformats.org/drawingml/2006/main" noChangeAspect="1"/>
+            </wp:cNvGraphicFramePr>
+            <a:graphic xmlns:a="http://schemas.openxmlformats.org/drawingml/2006/main">
+              <a:graphicData uri="http://schemas.openxmlformats.org/drawingml/2006/picture">
+                <pic:pic xmlns:pic="http://schemas.openxmlformats.org/drawingml/2006/picture">
+                  <pic:nvPicPr>
+                    <pic:cNvPr id="0" name="banco-comunidade.png"/>
+                    <pic:cNvPicPr/>
+                  </pic:nvPicPr>
+                  <pic:blipFill>
+                    <a:blip r:embed="rIdRot15"/>
+                    <a:stretch>
+                      <a:fillRect/>
+                    </a:stretch>
+                  </pic:blipFill>
+                  <pic:spPr>
+                    <a:xfrm>
+                      <a:off x="0" y="0"/>
+                      <a:ext cx="6152515" cy="6446074"/>
+                    </a:xfrm>
+                    <a:prstGeom prst="rect">
+                      <a:avLst/>
+                    </a:prstGeom>
+                  </pic:spPr>
+                </pic:pic>
+              </a:graphicData>
+            </a:graphic>
+          </wp:inline>
+        </w:drawing>
+      </w:r>
+    </w:p>
+    <w:p>
+      <w:pPr>
+        <w:keepNext/>
+        <w:spacing w:after="60"/>
+        <w:rPr>
+          <w:lang w:val="pt-BR"/>
+        </w:rPr>
+      </w:pPr>
+      <w:r>
+        <w:rPr>
+          <w:b/>
+          <w:lang w:val="pt-BR"/>
+        </w:rPr>
+        <w:t xml:space="preserve">Times, organizadores e ranking</w:t>
+      </w:r>
+    </w:p>
+    <w:p>
+      <w:pPr>
+        <w:spacing w:after="200"/>
+        <w:jc w:val="center"/>
+        <w:rPr>
+          <w:lang w:val="pt-BR"/>
+        </w:rPr>
+      </w:pPr>
+      <w:r>
+        <w:rPr>
+          <w:noProof/>
+        </w:rPr>
+        <w:drawing>
+          <wp:inline distT="0" distB="0" distL="0" distR="0">
+            <wp:extent cx="3770114" cy="7900000"/>
+            <wp:effectExtent l="0" t="0" r="0" b="0"/>
+            <wp:docPr id="910016" name="banco-times.png" descr="Diagrama do banco: Times, organizadores e ranking"/>
+            <wp:cNvGraphicFramePr>
+              <a:graphicFrameLocks xmlns:a="http://schemas.openxmlformats.org/drawingml/2006/main" noChangeAspect="1"/>
+            </wp:cNvGraphicFramePr>
+            <a:graphic xmlns:a="http://schemas.openxmlformats.org/drawingml/2006/main">
+              <a:graphicData uri="http://schemas.openxmlformats.org/drawingml/2006/picture">
+                <pic:pic xmlns:pic="http://schemas.openxmlformats.org/drawingml/2006/picture">
+                  <pic:nvPicPr>
+                    <pic:cNvPr id="0" name="banco-times.png"/>
+                    <pic:cNvPicPr/>
+                  </pic:nvPicPr>
+                  <pic:blipFill>
+                    <a:blip r:embed="rIdRot16"/>
+                    <a:stretch>
+                      <a:fillRect/>
+                    </a:stretch>
+                  </pic:blipFill>
+                  <pic:spPr>
+                    <a:xfrm>
+                      <a:off x="0" y="0"/>
+                      <a:ext cx="3770114" cy="7900000"/>
+                    </a:xfrm>
+                    <a:prstGeom prst="rect">
+                      <a:avLst/>
+                    </a:prstGeom>
+                  </pic:spPr>
+                </pic:pic>
+              </a:graphicData>
+            </a:graphic>
+          </wp:inline>
+        </w:drawing>
+      </w:r>
+    </w:p>
+    <w:p>
+      <w:pPr>
+        <w:keepNext/>
+        <w:spacing w:after="60"/>
+        <w:rPr>
+          <w:lang w:val="pt-BR"/>
+        </w:rPr>
+      </w:pPr>
+      <w:r>
+        <w:rPr>
+          <w:b/>
+          <w:lang w:val="pt-BR"/>
+        </w:rPr>
+        <w:t xml:space="preserve">Partidas e quadras</w:t>
+      </w:r>
+    </w:p>
+    <w:p>
+      <w:pPr>
+        <w:spacing w:after="200"/>
+        <w:jc w:val="center"/>
+        <w:rPr>
+          <w:lang w:val="pt-BR"/>
+        </w:rPr>
+      </w:pPr>
+      <w:r>
+        <w:rPr>
+          <w:noProof/>
+        </w:rPr>
+        <w:drawing>
+          <wp:inline distT="0" distB="0" distL="0" distR="0">
+            <wp:extent cx="6152515" cy="6482752"/>
+            <wp:effectExtent l="0" t="0" r="0" b="0"/>
+            <wp:docPr id="910017" name="banco-partidas.png" descr="Diagrama do banco: Partidas e quadras"/>
+            <wp:cNvGraphicFramePr>
+              <a:graphicFrameLocks xmlns:a="http://schemas.openxmlformats.org/drawingml/2006/main" noChangeAspect="1"/>
+            </wp:cNvGraphicFramePr>
+            <a:graphic xmlns:a="http://schemas.openxmlformats.org/drawingml/2006/main">
+              <a:graphicData uri="http://schemas.openxmlformats.org/drawingml/2006/picture">
+                <pic:pic xmlns:pic="http://schemas.openxmlformats.org/drawingml/2006/picture">
+                  <pic:nvPicPr>
+                    <pic:cNvPr id="0" name="banco-partidas.png"/>
+                    <pic:cNvPicPr/>
+                  </pic:nvPicPr>
+                  <pic:blipFill>
+                    <a:blip r:embed="rIdRot17"/>
+                    <a:stretch>
+                      <a:fillRect/>
+                    </a:stretch>
+                  </pic:blipFill>
+                  <pic:spPr>
+                    <a:xfrm>
+                      <a:off x="0" y="0"/>
+                      <a:ext cx="6152515" cy="6482752"/>
+                    </a:xfrm>
+                    <a:prstGeom prst="rect">
+                      <a:avLst/>
+                    </a:prstGeom>
+                  </pic:spPr>
+                </pic:pic>
+              </a:graphicData>
+            </a:graphic>
+          </wp:inline>
+        </w:drawing>
+      </w:r>
+    </w:p>
+    <w:p>
+      <w:pPr>
+        <w:keepNext/>
+        <w:spacing w:after="60"/>
+        <w:rPr>
+          <w:lang w:val="pt-BR"/>
+        </w:rPr>
+      </w:pPr>
+      <w:r>
+        <w:rPr>
+          <w:b/>
+          <w:lang w:val="pt-BR"/>
+        </w:rPr>
+        <w:t xml:space="preserve">Campeonatos, inscrições e corrida</w:t>
+      </w:r>
+    </w:p>
+    <w:p>
+      <w:pPr>
+        <w:spacing w:after="200"/>
+        <w:jc w:val="center"/>
+        <w:rPr>
+          <w:lang w:val="pt-BR"/>
+        </w:rPr>
+      </w:pPr>
+      <w:r>
+        <w:rPr>
+          <w:noProof/>
+        </w:rPr>
+        <w:drawing>
+          <wp:inline distT="0" distB="0" distL="0" distR="0">
+            <wp:extent cx="5176381" cy="7900000"/>
+            <wp:effectExtent l="0" t="0" r="0" b="0"/>
+            <wp:docPr id="910018" name="banco-eventos.png" descr="Diagrama do banco: Campeonatos, inscrições e corrida"/>
+            <wp:cNvGraphicFramePr>
+              <a:graphicFrameLocks xmlns:a="http://schemas.openxmlformats.org/drawingml/2006/main" noChangeAspect="1"/>
+            </wp:cNvGraphicFramePr>
+            <a:graphic xmlns:a="http://schemas.openxmlformats.org/drawingml/2006/main">
+              <a:graphicData uri="http://schemas.openxmlformats.org/drawingml/2006/picture">
+                <pic:pic xmlns:pic="http://schemas.openxmlformats.org/drawingml/2006/picture">
+                  <pic:nvPicPr>
+                    <pic:cNvPr id="0" name="banco-eventos.png"/>
+                    <pic:cNvPicPr/>
+                  </pic:nvPicPr>
+                  <pic:blipFill>
+                    <a:blip r:embed="rIdRot18"/>
+                    <a:stretch>
+                      <a:fillRect/>
+                    </a:stretch>
+                  </pic:blipFill>
+                  <pic:spPr>
+                    <a:xfrm>
+                      <a:off x="0" y="0"/>
+                      <a:ext cx="5176381" cy="7900000"/>
+                    </a:xfrm>
+                    <a:prstGeom prst="rect">
+                      <a:avLst/>
+                    </a:prstGeom>
+                  </pic:spPr>
+                </pic:pic>
+              </a:graphicData>
+            </a:graphic>
+          </wp:inline>
+        </w:drawing>
+      </w:r>
     </w:p>
     <w:p>
       <w:pPr>

</xml_diff>